<commit_message>
feat: reemplaza POS-Analytics por el proyecto Arken
</commit_message>
<xml_diff>
--- a/Fase 1/Evidencias Grupales/1.5_GuiaEstudiante_Fase 1_Definicion Proyecto APT (Español).docx
+++ b/Fase 1/Evidencias Grupales/1.5_GuiaEstudiante_Fase 1_Definicion Proyecto APT (Español).docx
@@ -595,9 +595,8 @@
               <w:rPr>
                 <w:lang w:val="es-ES"/>
               </w:rPr>
-              <w:t xml:space="preserve">Joaquín Cabrera Macaya, Sebastian Quilodran, Brayan Cid</w:t>
+              <w:t xml:space="preserve">Joaquín Cabrera Macaya</w:t>
             </w:r>
-            <w:r/>
           </w:p>
         </w:tc>
       </w:tr>
@@ -652,15 +651,9 @@
               <w:rPr/>
             </w:pPr>
             <w:r>
-              <w:t xml:space="preserve">20.</w:t>
+              <w:rPr/>
+              <w:t xml:space="preserve">20.694.971-6</w:t>
             </w:r>
-            <w:r>
-              <w:rPr>
-                <w:lang w:val="es-ES"/>
-              </w:rPr>
-              <w:t xml:space="preserve">694.971-6, ,</w:t>
-            </w:r>
-            <w:r/>
           </w:p>
         </w:tc>
       </w:tr>
@@ -997,23 +990,7 @@
                 <w:sz w:val="20"/>
                 <w:szCs w:val="20"/>
               </w:rPr>
-            </w:r>
-            <w:r>
-              <w:rPr>
-                <w:sz w:val="20"/>
-                <w:szCs w:val="20"/>
-              </w:rPr>
-              <w:t xml:space="preserve">Plataforma Híbrida de Punto de Venta con Motor de Minería de Datos Local y Sincronización Cloud para Gestión y Analítica Remota en Comercio Minorista</w:t>
-            </w:r>
-            <w:r>
-              <w:rPr>
-                <w:b/>
-              </w:rPr>
-            </w:r>
-            <w:r>
-              <w:rPr>
-                <w:b/>
-              </w:rPr>
+              <w:t xml:space="preserve">Plataforma Web Multi-Empresa para la Centralización de la Gestión Comercial de Automotoras, con Vitrina Digital Propia y Marketplace Común de Vehículos</w:t>
             </w:r>
           </w:p>
         </w:tc>
@@ -1079,19 +1056,31 @@
               </w:rPr>
               <w:t xml:space="preserve">El desarrollo del proyecto involucra las siguientes áreas de desempeño profesional contempladas en el plan de estudios de Ingeniería en Informática:</w:t>
             </w:r>
+          </w:p>
+          <w:p>
+            <w:pPr>
+              <w:pStyle w:val="1006"/>
+              <w:numPr>
+                <w:ilvl w:val="0"/>
+                <w:numId w:val="11"/>
+              </w:numPr>
+              <w:pBdr/>
+              <w:spacing/>
+              <w:ind/>
+              <w:rPr>
+                <w:sz w:val="20"/>
+                <w:szCs w:val="20"/>
+                <w:highlight w:val="none"/>
+                <w:lang w:val="es-ES"/>
+              </w:rPr>
+            </w:pPr>
             <w:r>
               <w:rPr>
                 <w:sz w:val="20"/>
                 <w:szCs w:val="20"/>
-                <w:highlight w:val="none"/>
+                <w:lang w:val="es-ES"/>
               </w:rPr>
-            </w:r>
-            <w:r>
-              <w:rPr>
-                <w:sz w:val="20"/>
-                <w:szCs w:val="20"/>
-                <w:highlight w:val="none"/>
-              </w:rPr>
+              <w:t xml:space="preserve">Arquitectura y programación de software</w:t>
             </w:r>
           </w:p>
           <w:p>
@@ -1115,26 +1104,9 @@
               <w:rPr>
                 <w:sz w:val="20"/>
                 <w:szCs w:val="20"/>
-                <w:highlight w:val="none"/>
                 <w:lang w:val="es-ES"/>
               </w:rPr>
-              <w:t xml:space="preserve">Arquitectura y programación de software</w:t>
-            </w:r>
-            <w:r>
-              <w:rPr>
-                <w:sz w:val="20"/>
-                <w:szCs w:val="20"/>
-                <w:highlight w:val="none"/>
-                <w:lang w:val="es-ES"/>
-              </w:rPr>
-            </w:r>
-            <w:r>
-              <w:rPr>
-                <w:sz w:val="20"/>
-                <w:szCs w:val="20"/>
-                <w:highlight w:val="none"/>
-                <w:lang w:val="es-ES"/>
-              </w:rPr>
+              <w:t xml:space="preserve">Gestión y modelamiento de bases de datos</w:t>
             </w:r>
           </w:p>
           <w:p>
@@ -1158,26 +1130,9 @@
               <w:rPr>
                 <w:sz w:val="20"/>
                 <w:szCs w:val="20"/>
-                <w:highlight w:val="none"/>
                 <w:lang w:val="es-ES"/>
               </w:rPr>
-              <w:t xml:space="preserve">Gestión y modelamiento de bases de datos</w:t>
-            </w:r>
-            <w:r>
-              <w:rPr>
-                <w:sz w:val="20"/>
-                <w:szCs w:val="20"/>
-                <w:highlight w:val="none"/>
-                <w:lang w:val="es-ES"/>
-              </w:rPr>
-            </w:r>
-            <w:r>
-              <w:rPr>
-                <w:sz w:val="20"/>
-                <w:szCs w:val="20"/>
-                <w:highlight w:val="none"/>
-                <w:lang w:val="es-ES"/>
-              </w:rPr>
+              <w:t xml:space="preserve">Análisis de datos e indicadores de negocio</w:t>
             </w:r>
           </w:p>
           <w:p>
@@ -1201,26 +1156,9 @@
               <w:rPr>
                 <w:sz w:val="20"/>
                 <w:szCs w:val="20"/>
-                <w:highlight w:val="none"/>
                 <w:lang w:val="es-ES"/>
               </w:rPr>
-              <w:t xml:space="preserve">Inteligencia de negocios y analítica de datos</w:t>
-            </w:r>
-            <w:r>
-              <w:rPr>
-                <w:sz w:val="20"/>
-                <w:szCs w:val="20"/>
-                <w:highlight w:val="none"/>
-                <w:lang w:val="es-ES"/>
-              </w:rPr>
-            </w:r>
-            <w:r>
-              <w:rPr>
-                <w:sz w:val="20"/>
-                <w:szCs w:val="20"/>
-                <w:highlight w:val="none"/>
-                <w:lang w:val="es-ES"/>
-              </w:rPr>
+              <w:t xml:space="preserve">Ciberseguridad y calidad</w:t>
             </w:r>
           </w:p>
           <w:p>
@@ -1244,66 +1182,9 @@
               <w:rPr>
                 <w:sz w:val="20"/>
                 <w:szCs w:val="20"/>
-                <w:highlight w:val="none"/>
                 <w:lang w:val="es-ES"/>
               </w:rPr>
-              <w:t xml:space="preserve">Ciberseguridad y calidad</w:t>
-            </w:r>
-            <w:r>
-              <w:rPr>
-                <w:sz w:val="20"/>
-                <w:szCs w:val="20"/>
-                <w:highlight w:val="none"/>
-                <w:lang w:val="es-ES"/>
-              </w:rPr>
-            </w:r>
-            <w:r>
-              <w:rPr>
-                <w:sz w:val="20"/>
-                <w:szCs w:val="20"/>
-                <w:highlight w:val="none"/>
-                <w:lang w:val="es-ES"/>
-              </w:rPr>
-            </w:r>
-          </w:p>
-          <w:p>
-            <w:pPr>
-              <w:pStyle w:val="1006"/>
-              <w:numPr>
-                <w:ilvl w:val="0"/>
-                <w:numId w:val="11"/>
-              </w:numPr>
-              <w:pBdr/>
-              <w:spacing/>
-              <w:ind/>
-              <w:rPr>
-                <w:sz w:val="20"/>
-                <w:szCs w:val="20"/>
-                <w:highlight w:val="none"/>
-              </w:rPr>
-            </w:pPr>
-            <w:r>
-              <w:rPr>
-                <w:sz w:val="20"/>
-                <w:szCs w:val="20"/>
-                <w:highlight w:val="none"/>
-                <w:lang w:val="es-ES"/>
-              </w:rPr>
-              <w:t xml:space="preserve">Planificación gestión de proyectos informáticos</w:t>
-            </w:r>
-            <w:r>
-              <w:rPr>
-                <w:sz w:val="20"/>
-                <w:szCs w:val="20"/>
-                <w:highlight w:val="none"/>
-              </w:rPr>
-            </w:r>
-            <w:r>
-              <w:rPr>
-                <w:sz w:val="20"/>
-                <w:szCs w:val="20"/>
-                <w:highlight w:val="none"/>
-              </w:rPr>
+              <w:t xml:space="preserve">Planificación y gestión de proyectos informáticos</w:t>
             </w:r>
           </w:p>
         </w:tc>
@@ -1397,19 +1278,7 @@
                 <w:sz w:val="20"/>
                 <w:szCs w:val="20"/>
               </w:rPr>
-              <w:t xml:space="preserve">Desarrollar soluciones de software modulares y desacopladas.  </w:t>
-            </w:r>
-            <w:r>
-              <w:rPr>
-                <w:sz w:val="20"/>
-                <w:szCs w:val="20"/>
-              </w:rPr>
-            </w:r>
-            <w:r>
-              <w:rPr>
-                <w:sz w:val="20"/>
-                <w:szCs w:val="20"/>
-              </w:rPr>
+              <w:t xml:space="preserve">Desarrollar soluciones de software modulares y desacopladas con arquitectura en capas.</w:t>
             </w:r>
           </w:p>
           <w:p>
@@ -1433,19 +1302,7 @@
                 <w:sz w:val="20"/>
                 <w:szCs w:val="20"/>
               </w:rPr>
-              <w:t xml:space="preserve">Construir y optimizar modelos de datos relacionales locales y remotos.  </w:t>
-            </w:r>
-            <w:r>
-              <w:rPr>
-                <w:sz w:val="20"/>
-                <w:szCs w:val="20"/>
-              </w:rPr>
-            </w:r>
-            <w:r>
-              <w:rPr>
-                <w:sz w:val="20"/>
-                <w:szCs w:val="20"/>
-              </w:rPr>
+              <w:t xml:space="preserve">Construir y optimizar modelos de datos relacionales con integridad garantizada desde la base de datos.</w:t>
             </w:r>
           </w:p>
           <w:p>
@@ -1469,19 +1326,7 @@
                 <w:sz w:val="20"/>
                 <w:szCs w:val="20"/>
               </w:rPr>
-              <w:t xml:space="preserve">Procesar y analizar volúmenes de datos transaccionales para la toma de decisiones estratégicas.  </w:t>
-            </w:r>
-            <w:r>
-              <w:rPr>
-                <w:sz w:val="20"/>
-                <w:szCs w:val="20"/>
-              </w:rPr>
-            </w:r>
-            <w:r>
-              <w:rPr>
-                <w:sz w:val="20"/>
-                <w:szCs w:val="20"/>
-              </w:rPr>
+              <w:t xml:space="preserve">Procesar y analizar datos transaccionales para obtener indicadores de apoyo a la toma de decisiones comerciales.</w:t>
             </w:r>
           </w:p>
           <w:p>
@@ -1505,26 +1350,7 @@
                 <w:sz w:val="20"/>
                 <w:szCs w:val="20"/>
               </w:rPr>
-              <w:t xml:space="preserve">Implementar políti</w:t>
-            </w:r>
-            <w:r>
-              <w:rPr>
-                <w:sz w:val="20"/>
-                <w:szCs w:val="20"/>
-              </w:rPr>
-              <w:t xml:space="preserve">cas y controles de seguridad informática.  </w:t>
-            </w:r>
-            <w:r>
-              <w:rPr>
-                <w:sz w:val="20"/>
-                <w:szCs w:val="20"/>
-              </w:rPr>
-            </w:r>
-            <w:r>
-              <w:rPr>
-                <w:sz w:val="20"/>
-                <w:szCs w:val="20"/>
-              </w:rPr>
+              <w:t xml:space="preserve">Implementar políticas y controles de seguridad informática: autenticación, control de acceso y protección de datos.</w:t>
             </w:r>
           </w:p>
           <w:p>
@@ -1548,19 +1374,7 @@
                 <w:sz w:val="20"/>
                 <w:szCs w:val="20"/>
               </w:rPr>
-              <w:t xml:space="preserve">Gestionar proyectos informáticos aplicando marcos ágiles (Scrum).  </w:t>
-            </w:r>
-            <w:r>
-              <w:rPr>
-                <w:sz w:val="20"/>
-                <w:szCs w:val="20"/>
-              </w:rPr>
-            </w:r>
-            <w:r>
-              <w:rPr>
-                <w:sz w:val="20"/>
-                <w:szCs w:val="20"/>
-              </w:rPr>
+              <w:t xml:space="preserve">Gestionar proyectos informáticos aplicando una metodología tradicional en cascada.</w:t>
             </w:r>
           </w:p>
         </w:tc>
@@ -1849,67 +1663,7 @@
                 <w:sz w:val="20"/>
                 <w:szCs w:val="20"/>
               </w:rPr>
-            </w:r>
-            <w:r>
-              <w:rPr>
-                <w:sz w:val="20"/>
-                <w:szCs w:val="20"/>
-              </w:rPr>
-              <w:t xml:space="preserve">El proyecto surge ante una brecha operativa común en el comercio minorista independiente: la falta de sistemas formales o el uso de cajas registradoras genéricas que solo registran ventas de forma pasiva. Es</w:t>
-            </w:r>
-            <w:r>
-              <w:rPr>
-                <w:sz w:val="20"/>
-                <w:szCs w:val="20"/>
-              </w:rPr>
-              <w:t xml:space="preserve">t</w:t>
-            </w:r>
-            <w:r>
-              <w:rPr>
-                <w:sz w:val="20"/>
-                <w:szCs w:val="20"/>
-              </w:rPr>
-              <w:t xml:space="preserve">o deja miles de registros transaccionales sin explotar, provocando falta de claridad en los márgenes netos de ganancia, desabastecimiento imprevisto de productos clave, dinero inmovilizado en mercadería sin rotación y decisiones de compra basadas únicament</w:t>
-            </w:r>
-            <w:r>
-              <w:rPr>
-                <w:sz w:val="20"/>
-                <w:szCs w:val="20"/>
-              </w:rPr>
-              <w:t xml:space="preserve">e</w:t>
-            </w:r>
-            <w:r>
-              <w:rPr>
-                <w:sz w:val="20"/>
-                <w:szCs w:val="20"/>
-              </w:rPr>
-              <w:t xml:space="preserve"> en la intuición.  La propuesta democratiza el acceso a la inteligencia de negocios y la minería de datos en pequeños comercios sin exigir infraestructura en la nube costosa ni licencias privativas, garantizando a la vez continuidad operativa total ante co</w:t>
-            </w:r>
-            <w:r>
-              <w:rPr>
-                <w:sz w:val="20"/>
-                <w:szCs w:val="20"/>
-              </w:rPr>
-              <w:t xml:space="preserve">rtes de Internet mediante una arquitectura local resiliente. Su impacto está validado directamente en terreno con comerciantes activos que requieren la plataforma para optimizar su rentabilidad y controlar su operación d</w:t>
-            </w:r>
-            <w:r>
-              <w:rPr>
-                <w:sz w:val="20"/>
-                <w:szCs w:val="20"/>
-              </w:rPr>
-              <w:t xml:space="preserve">iaria. </w:t>
-            </w:r>
-            <w:r>
-              <w:rPr>
-                <w:sz w:val="20"/>
-                <w:szCs w:val="20"/>
-              </w:rPr>
-            </w:r>
-            <w:r>
-              <w:rPr>
-                <w:sz w:val="20"/>
-                <w:szCs w:val="20"/>
-              </w:rPr>
+              <w:t xml:space="preserve">El proyecto surge ante una brecha operativa común en las automotoras pequeñas y medianas: la gestión del negocio en planillas Excel, cuadernos o sistemas armados a medida. Esto impide conocer la utilidad real de cada vehículo (los gastos de mecánica, pintura y trámites quedan registrados aparte), provoca cotizaciones y reservas emitidas sin numeración ni respaldo en PDF, deja a las automotoras con varias sucursales sin una vista consolidada y las hace depender de portales de avisos genéricos, sin una página propia que muestre su marca. La propuesta centraliza toda la operación en una sola plataforma y publica automáticamente el inventario en una vitrina propia y en un marketplace común, sin licencias costosas y con un costo de operación estimado de entre 11 y 15 dólares mensuales para al menos cinco automotoras. El sistema se valida mediante una automotora de demostración con datos de prueba y 163 pruebas automatizadas.</w:t>
             </w:r>
           </w:p>
         </w:tc>
@@ -1973,40 +1727,7 @@
                 <w:sz w:val="20"/>
                 <w:szCs w:val="20"/>
               </w:rPr>
-            </w:r>
-            <w:r>
-              <w:rPr>
-                <w:sz w:val="20"/>
-                <w:szCs w:val="20"/>
-              </w:rPr>
-              <w:t xml:space="preserve">El proyecto consiste en diseñar y desarrollar una plataforma integral de punto de venta</w:t>
-            </w:r>
-            <w:r>
-              <w:rPr>
-                <w:sz w:val="20"/>
-                <w:szCs w:val="20"/>
-                <w:lang w:val="es-ES"/>
-              </w:rPr>
-              <w:t xml:space="preserve"> </w:t>
-            </w:r>
-            <w:r>
-              <w:rPr>
-                <w:sz w:val="20"/>
-                <w:szCs w:val="20"/>
-              </w:rPr>
-              <w:t xml:space="preserve">y analítica comercial articulada en tres componentes tecnológicos interconectados:  </w:t>
-            </w:r>
-            <w:r>
-              <w:rPr>
-                <w:sz w:val="20"/>
-                <w:szCs w:val="20"/>
-              </w:rPr>
-            </w:r>
-            <w:r>
-              <w:rPr>
-                <w:sz w:val="20"/>
-                <w:szCs w:val="20"/>
-              </w:rPr>
+              <w:t xml:space="preserve">El proyecto consiste en diseñar y desarrollar una plataforma web multi-empresa y multi-sucursal articulada en tres componentes tecnológicos interconectados:</w:t>
             </w:r>
           </w:p>
           <w:p>
@@ -2025,40 +1746,7 @@
                 <w:sz w:val="20"/>
                 <w:szCs w:val="20"/>
               </w:rPr>
-              <w:t xml:space="preserve">1. Terminal POS de Mostrador (Offline-First): Aplicación de escritorio rápida y</w:t>
-            </w:r>
-            <w:r>
-              <w:rPr>
-                <w:sz w:val="20"/>
-                <w:szCs w:val="20"/>
-              </w:rPr>
-              <w:t xml:space="preserve"> </w:t>
-            </w:r>
-            <w:r>
-              <w:rPr>
-                <w:sz w:val="20"/>
-                <w:szCs w:val="20"/>
-              </w:rPr>
-              <w:t xml:space="preserve">autónoma encargada de los procesos de venta diaria (catálogo, cobro multicanal, control de inventario, turnos de caja, cuentas de crédito e impresión térmica). Garantiza continuidad operativa total y tiempos de respuesta inmediatos sin depender de conexión</w:t>
-            </w:r>
-            <w:r>
-              <w:rPr>
-                <w:sz w:val="20"/>
-                <w:szCs w:val="20"/>
-              </w:rPr>
-              <w:t xml:space="preserve"> a Internet.  </w:t>
-            </w:r>
-            <w:r>
-              <w:rPr>
-                <w:sz w:val="20"/>
-                <w:szCs w:val="20"/>
-              </w:rPr>
-            </w:r>
-            <w:r>
-              <w:rPr>
-                <w:sz w:val="20"/>
-                <w:szCs w:val="20"/>
-              </w:rPr>
+              <w:t xml:space="preserve">1. Sistema de Gestión (panel interno): Aplicación web con 18 módulos que administra sucursales, usuarios con tres roles, clientes, inventario de vehículos con fotos y documentos legales, gastos, consignaciones, cotizaciones, reservas, tasaciones y ventas con formas de pago combinables, junto con notificaciones, auditoría inmutable, dashboard, analítica y correos automáticos con PDF al cliente.</w:t>
             </w:r>
           </w:p>
           <w:p>
@@ -2077,26 +1765,7 @@
                 <w:sz w:val="20"/>
                 <w:szCs w:val="20"/>
               </w:rPr>
-              <w:t xml:space="preserve">2. Módulo de Análisis e Inteligencia de Ventas: Motor analítico local que procesa el historial transaccional en segundo plano. Descubre patrones temporales de venta (horarios y días de mayor demanda), evalúa la rentabilidad real por departamen</w:t>
-            </w:r>
-            <w:r>
-              <w:rPr>
-                <w:sz w:val="20"/>
-                <w:szCs w:val="20"/>
-              </w:rPr>
-              <w:t xml:space="preserve">to y extrae reglas de compra cruzada para sugerir combos comerciales y alertas preventivas de reposición en lenguaje de negocio accesible.  </w:t>
-            </w:r>
-            <w:r>
-              <w:rPr>
-                <w:sz w:val="20"/>
-                <w:szCs w:val="20"/>
-              </w:rPr>
-            </w:r>
-            <w:r>
-              <w:rPr>
-                <w:sz w:val="20"/>
-                <w:szCs w:val="20"/>
-              </w:rPr>
+              <w:t xml:space="preserve">2. Vitrina Pública por Automotora: Sitio propio en un subdominio (nombre-automotora.dominio.cl) que muestra automáticamente los vehículos publicados, con logo, portada, ubicación de las sucursales, contacto por WhatsApp y posicionamiento en buscadores (SEO).</w:t>
             </w:r>
           </w:p>
           <w:p>
@@ -2106,9 +1775,6 @@
               <w:ind/>
               <w:jc w:val="both"/>
               <w:rPr>
-                <w:bCs/>
-                <w:i/>
-                <w:color w:val="548dd4"/>
                 <w:sz w:val="20"/>
                 <w:szCs w:val="20"/>
               </w:rPr>
@@ -2118,32 +1784,7 @@
                 <w:sz w:val="20"/>
                 <w:szCs w:val="20"/>
               </w:rPr>
-              <w:t xml:space="preserve">3. Capa de Supervisión Remota en la Nube: Servicio de replicación asíncrona e incremental que respalda los datos en l</w:t>
-            </w:r>
-            <w:r>
-              <w:rPr>
-                <w:sz w:val="20"/>
-                <w:szCs w:val="20"/>
-              </w:rPr>
-              <w:t xml:space="preserve">a nube y alimenta un panel web móvil en tiempo real, permitiendo al propietario monitorear la recaudación y consultar métricas estratégicas desde cualquier lugar. </w:t>
-            </w:r>
-            <w:r>
-              <w:rPr>
-                <w:bCs/>
-                <w:i/>
-                <w:color w:val="548dd4"/>
-                <w:sz w:val="20"/>
-                <w:szCs w:val="20"/>
-              </w:rPr>
-            </w:r>
-            <w:r>
-              <w:rPr>
-                <w:bCs/>
-                <w:i/>
-                <w:color w:val="548dd4"/>
-                <w:sz w:val="20"/>
-                <w:szCs w:val="20"/>
-              </w:rPr>
+              <w:t xml:space="preserve">3. Marketplace Global: Vitrina común de acceso anónimo donde cualquier persona busca autos y motos entre la oferta de todas las automotoras mediante filtros dinámicos y las contacta directamente por WhatsApp, sin exponer nunca datos internos como patente, costos o consignación.</w:t>
             </w:r>
           </w:p>
         </w:tc>
@@ -2206,26 +1847,9 @@
               <w:rPr>
                 <w:sz w:val="20"/>
                 <w:szCs w:val="20"/>
+                <w:lang w:val="es-ES"/>
               </w:rPr>
-            </w:r>
-            <w:r>
-              <w:rPr>
-                <w:sz w:val="20"/>
-                <w:szCs w:val="20"/>
-              </w:rPr>
-              <w:t xml:space="preserve">El proyecto articula transversalmente las competencias troncales de la carrera:  </w:t>
-            </w:r>
-            <w:r>
-              <w:rPr>
-                <w:sz w:val="20"/>
-                <w:szCs w:val="20"/>
-              </w:rPr>
-            </w:r>
-            <w:r>
-              <w:rPr>
-                <w:sz w:val="20"/>
-                <w:szCs w:val="20"/>
-              </w:rPr>
+              <w:t xml:space="preserve">El proyecto articula transversalmente las competencias troncales de la carrera:</w:t>
             </w:r>
           </w:p>
           <w:p>
@@ -2241,37 +1865,20 @@
             </w:pPr>
             <w:r>
               <w:rPr>
+                <w:b/>
                 <w:sz w:val="20"/>
                 <w:szCs w:val="20"/>
                 <w:lang w:val="es-ES"/>
               </w:rPr>
-              <w:t xml:space="preserve">-</w:t>
+              <w:t xml:space="preserve">- Modelamiento y Bases de Datos: </w:t>
             </w:r>
             <w:r>
               <w:rPr>
                 <w:sz w:val="20"/>
                 <w:szCs w:val="20"/>
+                <w:lang w:val="es-ES"/>
               </w:rPr>
-              <w:t xml:space="preserve"> Big Data y Análisis de Datos: Se aplican procesos ETL locales y técnicas de minería de datos sobre registros transaccionales brutos para modelar tendencias de venta, reglas d</w:t>
-            </w:r>
-            <w:r>
-              <w:rPr>
-                <w:sz w:val="20"/>
-                <w:szCs w:val="20"/>
-              </w:rPr>
-              <w:t xml:space="preserve">e afinidad y rentabilidad.  </w:t>
-            </w:r>
-            <w:r>
-              <w:rPr>
-                <w:sz w:val="20"/>
-                <w:szCs w:val="20"/>
-              </w:rPr>
-            </w:r>
-            <w:r>
-              <w:rPr>
-                <w:sz w:val="20"/>
-                <w:szCs w:val="20"/>
-              </w:rPr>
+              <w:t xml:space="preserve">Se diseña un esquema relacional normalizado de 23 tablas en PostgreSQL con enumeraciones, restricciones CHECK, índices únicos parciales, bajas lógicas y auditoría inmutable mediante triggers.</w:t>
             </w:r>
           </w:p>
           <w:p>
@@ -2287,37 +1894,20 @@
             </w:pPr>
             <w:r>
               <w:rPr>
+                <w:b/>
                 <w:sz w:val="20"/>
                 <w:szCs w:val="20"/>
                 <w:lang w:val="es-ES"/>
               </w:rPr>
-              <w:t xml:space="preserve">-</w:t>
+              <w:t xml:space="preserve">- Desarrollo de Soluciones de Software: </w:t>
             </w:r>
             <w:r>
               <w:rPr>
                 <w:sz w:val="20"/>
                 <w:szCs w:val="20"/>
+                <w:lang w:val="es-ES"/>
               </w:rPr>
-              <w:t xml:space="preserve"> Modelamiento y Bases de Datos: Se diseñan modelos relacionales normalizados tanto a nivel local como en la nube, estructurando tablas de auditoría, índices compuestos y esquemas outbox que resguardan la velocidad de inserción e</w:t>
-            </w:r>
-            <w:r>
-              <w:rPr>
-                <w:sz w:val="20"/>
-                <w:szCs w:val="20"/>
-              </w:rPr>
-              <w:t xml:space="preserve">n caja.  </w:t>
-            </w:r>
-            <w:r>
-              <w:rPr>
-                <w:sz w:val="20"/>
-                <w:szCs w:val="20"/>
-              </w:rPr>
-            </w:r>
-            <w:r>
-              <w:rPr>
-                <w:sz w:val="20"/>
-                <w:szCs w:val="20"/>
-              </w:rPr>
+              <w:t xml:space="preserve">Se construyen tres aplicaciones (API en NestJS, panel en React y sitio público en Next.js) y un paquete compartido, con arquitectura en capas y TypeScript estricto.</w:t>
             </w:r>
           </w:p>
           <w:p>
@@ -2333,30 +1923,20 @@
             </w:pPr>
             <w:r>
               <w:rPr>
+                <w:b/>
                 <w:sz w:val="20"/>
                 <w:szCs w:val="20"/>
                 <w:lang w:val="es-ES"/>
               </w:rPr>
-              <w:t xml:space="preserve">-</w:t>
+              <w:t xml:space="preserve">- Arquitectura de Soluciones Sistémicas: </w:t>
             </w:r>
             <w:r>
               <w:rPr>
                 <w:sz w:val="20"/>
                 <w:szCs w:val="20"/>
+                <w:lang w:val="es-ES"/>
               </w:rPr>
-              <w:t xml:space="preserve"> Desarrollo de Soluciones de Software: Se construye una arquitectura modular desacoplada que comunica la aplicación con periféricos físicos de caja y genera interfaces ergonómicas para caja y supervisión móvil.  </w:t>
-            </w:r>
-            <w:r>
-              <w:rPr>
-                <w:sz w:val="20"/>
-                <w:szCs w:val="20"/>
-              </w:rPr>
-            </w:r>
-            <w:r>
-              <w:rPr>
-                <w:sz w:val="20"/>
-                <w:szCs w:val="20"/>
-              </w:rPr>
+              <w:t xml:space="preserve">Se implementa un modelo multi-empresa de esquema compartido con aislamiento por automotora y sucursal, tareas programadas y patrón outbox para el envío confiable de correos.</w:t>
             </w:r>
           </w:p>
           <w:p>
@@ -2372,37 +1952,20 @@
             </w:pPr>
             <w:r>
               <w:rPr>
+                <w:b/>
                 <w:sz w:val="20"/>
                 <w:szCs w:val="20"/>
                 <w:lang w:val="es-ES"/>
               </w:rPr>
-              <w:t xml:space="preserve">-</w:t>
+              <w:t xml:space="preserve">- Seguridad Informática: </w:t>
             </w:r>
             <w:r>
               <w:rPr>
                 <w:sz w:val="20"/>
                 <w:szCs w:val="20"/>
+                <w:lang w:val="es-ES"/>
               </w:rPr>
-              <w:t xml:space="preserve"> Seguridad Informática: Se estable</w:t>
-            </w:r>
-            <w:r>
-              <w:rPr>
-                <w:sz w:val="20"/>
-                <w:szCs w:val="20"/>
-              </w:rPr>
-              <w:t xml:space="preserve">cen controles de acceso basados en roles (administrador/cajero), autenticación por PIN, sanitización de consultas  SQL y cifrado de conexiones hacia la nube.  </w:t>
-            </w:r>
-            <w:r>
-              <w:rPr>
-                <w:sz w:val="20"/>
-                <w:szCs w:val="20"/>
-              </w:rPr>
-            </w:r>
-            <w:r>
-              <w:rPr>
-                <w:sz w:val="20"/>
-                <w:szCs w:val="20"/>
-              </w:rPr>
+              <w:t xml:space="preserve">Se aplica hash de contraseñas con argon2id, sesiones JWT con cookies httpOnly, protección CSRF, límite de peticiones, control de acceso por rol y consultas parametrizadas.</w:t>
             </w:r>
           </w:p>
           <w:p>
@@ -2418,37 +1981,49 @@
             </w:pPr>
             <w:r>
               <w:rPr>
+                <w:b/>
                 <w:sz w:val="20"/>
                 <w:szCs w:val="20"/>
                 <w:lang w:val="es-ES"/>
               </w:rPr>
-              <w:t xml:space="preserve">-</w:t>
+              <w:t xml:space="preserve">- Análisis de Datos: </w:t>
             </w:r>
             <w:r>
               <w:rPr>
                 <w:sz w:val="20"/>
                 <w:szCs w:val="20"/>
+                <w:lang w:val="es-ES"/>
               </w:rPr>
-              <w:t xml:space="preserve"> Gestión de Proyectos: Se adopta Scrum mediante 7 Sprints quincenales, controla</w:t>
+              <w:t xml:space="preserve">Se agregan los registros transaccionales para obtener utilidad real por vehículo, ticket promedio, días hasta vender y antigüedad del inventario.</w:t>
+            </w:r>
+          </w:p>
+          <w:p>
+            <w:pPr>
+              <w:pBdr/>
+              <w:spacing w:after="240" w:before="240"/>
+              <w:ind/>
+              <w:jc w:val="both"/>
+              <w:rPr>
+                <w:sz w:val="20"/>
+                <w:szCs w:val="20"/>
+              </w:rPr>
+            </w:pPr>
+            <w:r>
+              <w:rPr>
+                <w:b/>
+                <w:sz w:val="20"/>
+                <w:szCs w:val="20"/>
+                <w:lang w:val="es-ES"/>
+              </w:rPr>
+              <w:t xml:space="preserve">- Gestión de Proyectos: </w:t>
             </w:r>
             <w:r>
               <w:rPr>
                 <w:sz w:val="20"/>
                 <w:szCs w:val="20"/>
+                <w:lang w:val="es-ES"/>
               </w:rPr>
-              <w:t xml:space="preserve">ndo el ciclo de vida mediante historias de usuario y revisiones iterativas. </w:t>
-            </w:r>
-            <w:r>
-              <w:rPr>
-                <w:sz w:val="20"/>
-                <w:szCs w:val="20"/>
-              </w:rPr>
-            </w:r>
-            <w:r>
-              <w:rPr>
-                <w:sz w:val="20"/>
-                <w:szCs w:val="20"/>
-              </w:rPr>
+              <w:t xml:space="preserve">Se adopta el modelo en cascada con cinco fases secuenciales, entregables formales e hitos de aprobación.</w:t>
             </w:r>
           </w:p>
         </w:tc>
@@ -2513,101 +2088,7 @@
                 <w:szCs w:val="20"/>
                 <w:lang w:val="es-ES"/>
               </w:rPr>
-              <w:t xml:space="preserve">Nuestros</w:t>
-            </w:r>
-            <w:r>
-              <w:rPr>
-                <w:sz w:val="20"/>
-                <w:szCs w:val="20"/>
-                <w:lang w:val="es-ES"/>
-              </w:rPr>
-              <w:t xml:space="preserve"> </w:t>
-            </w:r>
-            <w:r>
-              <w:rPr>
-                <w:sz w:val="20"/>
-                <w:szCs w:val="20"/>
-              </w:rPr>
-              <w:t xml:space="preserve">intereses profesionales están orientados a la ingeniería de datos aplicada, la arquitectura de sistemas distribuidos y la ciberseguridad en entornos productivos. El proyecto APT </w:t>
-            </w:r>
-            <w:r>
-              <w:rPr>
-                <w:sz w:val="20"/>
-                <w:szCs w:val="20"/>
-                <w:lang w:val="es-ES"/>
-              </w:rPr>
-              <w:t xml:space="preserve">nos</w:t>
-            </w:r>
-            <w:r>
-              <w:rPr>
-                <w:sz w:val="20"/>
-                <w:szCs w:val="20"/>
-                <w:lang w:val="es-ES"/>
-              </w:rPr>
-              <w:t xml:space="preserve"> </w:t>
-            </w:r>
-            <w:r>
-              <w:rPr>
-                <w:sz w:val="20"/>
-                <w:szCs w:val="20"/>
-              </w:rPr>
-              <w:t xml:space="preserve">permite abordar problemáticas de alta exigencia técnica: proce</w:t>
-            </w:r>
-            <w:r>
-              <w:rPr>
-                <w:sz w:val="20"/>
-                <w:szCs w:val="20"/>
-              </w:rPr>
-              <w:t xml:space="preserve">s</w:t>
-            </w:r>
-            <w:r>
-              <w:rPr>
-                <w:sz w:val="20"/>
-                <w:szCs w:val="20"/>
-              </w:rPr>
-              <w:t xml:space="preserve">ar algoritmos analíticos pesados sobre bases de datos locales sin degradar la fluidez en el cobro, desplegar canales de sincronización asíncronos tolerantes a fallos de conectividad y transformar datos transaccionales brutos en herramientas de decisión que</w:t>
-            </w:r>
-            <w:r>
-              <w:rPr>
-                <w:sz w:val="20"/>
-                <w:szCs w:val="20"/>
-              </w:rPr>
-              <w:t xml:space="preserve"> aporten rentabilidad económica comprobable. Realizar este proyecto consolida </w:t>
-            </w:r>
-            <w:r>
-              <w:rPr>
-                <w:sz w:val="20"/>
-                <w:szCs w:val="20"/>
-                <w:lang w:val="es-ES"/>
-              </w:rPr>
-              <w:t xml:space="preserve">nuestra</w:t>
-            </w:r>
-            <w:r>
-              <w:rPr>
-                <w:sz w:val="20"/>
-                <w:szCs w:val="20"/>
-                <w:lang w:val="es-ES"/>
-              </w:rPr>
-              <w:t xml:space="preserve"> </w:t>
-            </w:r>
-            <w:r>
-              <w:rPr>
-                <w:sz w:val="20"/>
-                <w:szCs w:val="20"/>
-              </w:rPr>
-              <w:t xml:space="preserve">formación práctica al abarcar el ciclo completo de ingeniería (diseño, desarrollo, aseguramiento de calidad y validación con clientes activos)</w:t>
-            </w:r>
-            <w:r>
-              <w:rPr>
-                <w:sz w:val="20"/>
-                <w:szCs w:val="20"/>
-              </w:rPr>
-            </w:r>
-            <w:r>
-              <w:rPr>
-                <w:sz w:val="20"/>
-                <w:szCs w:val="20"/>
-              </w:rPr>
+              <w:t xml:space="preserve">Mis intereses profesionales están orientados al desarrollo de software de extremo a extremo, la arquitectura de aplicaciones web para el negocio y la ingeniería de datos aplicada. El proyecto APT me permite abordar problemáticas de alta exigencia técnica: aislar de forma segura los datos de múltiples empresas dentro de una misma instalación, asegurar la integridad de operaciones críticas bajo concurrencia (como la numeración correlativa de documentos y el cierre de una venta) y construir un flujo de despliegue continuo sobre infraestructura propia. Realizar este proyecto consolida mi formación práctica al abarcar el ciclo completo de ingeniería: análisis, diseño, desarrollo, aseguramiento de calidad y despliegue.</w:t>
             </w:r>
           </w:p>
         </w:tc>
@@ -2676,26 +2157,9 @@
               <w:rPr>
                 <w:sz w:val="20"/>
                 <w:szCs w:val="20"/>
+                <w:lang w:val="es-ES"/>
               </w:rPr>
-            </w:r>
-            <w:r>
-              <w:rPr>
-                <w:sz w:val="20"/>
-                <w:szCs w:val="20"/>
-              </w:rPr>
-              <w:t xml:space="preserve">El proyecto presenta plena viabilidad operativa, temporal y de recursos:  </w:t>
-            </w:r>
-            <w:r>
-              <w:rPr>
-                <w:sz w:val="20"/>
-                <w:szCs w:val="20"/>
-              </w:rPr>
-            </w:r>
-            <w:r>
-              <w:rPr>
-                <w:sz w:val="20"/>
-                <w:szCs w:val="20"/>
-              </w:rPr>
+              <w:t xml:space="preserve">El proyecto presenta viabilidad operativa, temporal y de recursos:</w:t>
             </w:r>
           </w:p>
           <w:p>
@@ -2717,18 +2181,12 @@
             </w:pPr>
             <w:r>
               <w:rPr>
+                <w:b/>
                 <w:sz w:val="20"/>
                 <w:szCs w:val="20"/>
                 <w:lang w:val="es-ES"/>
               </w:rPr>
-              <w:t xml:space="preserve">-</w:t>
-            </w:r>
-            <w:r>
-              <w:rPr>
-                <w:sz w:val="20"/>
-                <w:szCs w:val="20"/>
-              </w:rPr>
-              <w:t xml:space="preserve"> Tiempo y dedicación: El marco de 14 semanas lectivas del semestre</w:t>
+              <w:t xml:space="preserve">- Tiempo y dedicación: </w:t>
             </w:r>
             <w:r>
               <w:rPr>
@@ -2736,33 +2194,7 @@
                 <w:szCs w:val="20"/>
                 <w:lang w:val="es-ES"/>
               </w:rPr>
-              <w:t xml:space="preserve"> </w:t>
-            </w:r>
-            <w:r>
-              <w:rPr>
-                <w:sz w:val="20"/>
-                <w:szCs w:val="20"/>
-              </w:rPr>
-              <w:t xml:space="preserve">permite desplegar 7 Sprints quincenales bajo Scrum, logrando un MVP operat</w:t>
-            </w:r>
-            <w:r>
-              <w:rPr>
-                <w:sz w:val="20"/>
-                <w:szCs w:val="20"/>
-              </w:rPr>
-              <w:t xml:space="preserve">ivo en caja a mitad de ciclo antes de integrar la analítica avanzada y la nube. Las horas formales de taller aseguran seguimiento continuo.  </w:t>
-            </w:r>
-            <w:r>
-              <w:rPr>
-                <w:sz w:val="20"/>
-                <w:szCs w:val="20"/>
-              </w:rPr>
-            </w:r>
-            <w:r>
-              <w:rPr>
-                <w:sz w:val="20"/>
-                <w:szCs w:val="20"/>
-              </w:rPr>
+              <w:t xml:space="preserve">El marco de 14 semanas lectivas permite desarrollar cinco fases secuenciales con hitos de aprobación. A la fecha, las fases de análisis y diseño están completas y el sistema funciona en el entorno de desarrollo, por lo que el trabajo restante se concentra en pruebas, despliegue y cierre.</w:t>
             </w:r>
           </w:p>
           <w:p>
@@ -2784,92 +2216,20 @@
             </w:pPr>
             <w:r>
               <w:rPr>
+                <w:b/>
                 <w:sz w:val="20"/>
                 <w:szCs w:val="20"/>
                 <w:lang w:val="es-ES"/>
               </w:rPr>
-              <w:t xml:space="preserve">-</w:t>
+              <w:t xml:space="preserve">- Materiales y recursos: </w:t>
             </w:r>
-            <w:r>
-              <w:rPr>
-                <w:sz w:val="20"/>
-                <w:szCs w:val="20"/>
-              </w:rPr>
-              <w:t xml:space="preserve"> Materiales y recursos: Se cuenta con hardware propio para desarrollo, periféricos físicos para pruebas de caja </w:t>
-            </w:r>
-            <w:r>
-              <w:rPr>
-                <w:sz w:val="20"/>
-                <w:szCs w:val="20"/>
-              </w:rPr>
-              <w:t xml:space="preserve"> y herramientas de desarrollo de libre acceso. La base de datos cloud opera sobre capas de servicio gratuitas administradas, sin incurrir en costos monetarios.  </w:t>
-            </w:r>
-            <w:r>
-              <w:rPr>
-                <w:sz w:val="20"/>
-                <w:szCs w:val="20"/>
-              </w:rPr>
-            </w:r>
-            <w:r>
-              <w:rPr>
-                <w:sz w:val="20"/>
-                <w:szCs w:val="20"/>
-              </w:rPr>
-            </w:r>
-          </w:p>
-          <w:p>
-            <w:pPr>
-              <w:pBdr>
-                <w:top w:val="none" w:color="000000" w:sz="4" w:space="0"/>
-                <w:left w:val="none" w:color="000000" w:sz="4" w:space="0"/>
-                <w:bottom w:val="none" w:color="000000" w:sz="4" w:space="0"/>
-                <w:right w:val="none" w:color="000000" w:sz="4" w:space="0"/>
-                <w:between w:val="none" w:color="000000" w:sz="4" w:space="0"/>
-              </w:pBdr>
-              <w:spacing/>
-              <w:ind/>
-              <w:jc w:val="both"/>
-              <w:rPr>
-                <w:sz w:val="20"/>
-                <w:szCs w:val="20"/>
-                <w:highlight w:val="none"/>
-              </w:rPr>
-            </w:pPr>
             <w:r>
               <w:rPr>
                 <w:sz w:val="20"/>
                 <w:szCs w:val="20"/>
                 <w:lang w:val="es-ES"/>
               </w:rPr>
-              <w:t xml:space="preserve">-</w:t>
-            </w:r>
-            <w:r>
-              <w:rPr>
-                <w:sz w:val="20"/>
-                <w:szCs w:val="20"/>
-              </w:rPr>
-              <w:t xml:space="preserve"> Factores facilitadores: La problemática está validada con come</w:t>
-            </w:r>
-            <w:r>
-              <w:rPr>
-                <w:sz w:val="20"/>
-                <w:szCs w:val="20"/>
-              </w:rPr>
-              <w:t xml:space="preserve">rciantes en operación (incluyendo una distribuidora), lo que provee requerimientos directos y escenarios de prueba auténticos.  </w:t>
-            </w:r>
-            <w:r>
-              <w:rPr>
-                <w:sz w:val="20"/>
-                <w:szCs w:val="20"/>
-                <w:highlight w:val="none"/>
-              </w:rPr>
-            </w:r>
-            <w:r>
-              <w:rPr>
-                <w:sz w:val="20"/>
-                <w:szCs w:val="20"/>
-                <w:highlight w:val="none"/>
-              </w:rPr>
+              <w:t xml:space="preserve">Se cuenta con hardware propio y herramientas de código abierto. La puesta en producción requiere un servidor virtual (3 vCPU, 4 GB de RAM), un dominio .cl y servicios gratuitos (Cloudflare, Caddy, GitHub Actions), con un costo estimado de 11 a 15 dólares mensuales.</w:t>
             </w:r>
           </w:p>
           <w:p>
@@ -2891,39 +2251,55 @@
             </w:pPr>
             <w:r>
               <w:rPr>
+                <w:b/>
                 <w:sz w:val="20"/>
                 <w:szCs w:val="20"/>
-                <w:highlight w:val="none"/>
+                <w:lang w:val="es-ES"/>
               </w:rPr>
+              <w:t xml:space="preserve">- Factores facilitadores: </w:t>
             </w:r>
             <w:r>
               <w:rPr>
                 <w:sz w:val="20"/>
                 <w:szCs w:val="20"/>
-                <w:highlight w:val="none"/>
                 <w:lang w:val="es-ES"/>
               </w:rPr>
-              <w:t xml:space="preserve">-</w:t>
+              <w:t xml:space="preserve">Documentación técnica y funcional completa, 163 pruebas automatizadas y un script de datos de demostración que genera una automotora con dos sucursales, usuarios de cada rol, clientes y vehículos en todos los estados.</w:t>
+            </w:r>
+          </w:p>
+          <w:p>
+            <w:pPr>
+              <w:pBdr>
+                <w:top w:val="none" w:color="000000" w:sz="4" w:space="0"/>
+                <w:left w:val="none" w:color="000000" w:sz="4" w:space="0"/>
+                <w:bottom w:val="none" w:color="000000" w:sz="4" w:space="0"/>
+                <w:right w:val="none" w:color="000000" w:sz="4" w:space="0"/>
+                <w:between w:val="none" w:color="000000" w:sz="4" w:space="0"/>
+              </w:pBdr>
+              <w:spacing/>
+              <w:ind/>
+              <w:jc w:val="both"/>
+              <w:rPr>
+                <w:sz w:val="20"/>
+                <w:szCs w:val="20"/>
+              </w:rPr>
+            </w:pPr>
+            <w:r>
+              <w:rPr>
+                <w:b/>
+                <w:sz w:val="20"/>
+                <w:szCs w:val="20"/>
+                <w:lang w:val="es-ES"/>
+              </w:rPr>
+              <w:t xml:space="preserve">- Factores obstaculizadores y mitigación: </w:t>
             </w:r>
             <w:r>
               <w:rPr>
                 <w:sz w:val="20"/>
                 <w:szCs w:val="20"/>
-                <w:highlight w:val="none"/>
+                <w:lang w:val="es-ES"/>
               </w:rPr>
-              <w:t xml:space="preserve"> Factores obstaculizadores y mitigación: El consumo de cómputo derivado de la analítica se mitiga ejecutando el procesamiento en hilos secundarios desacoplados. </w:t>
-            </w:r>
-            <w:r>
-              <w:rPr>
-                <w:sz w:val="20"/>
-                <w:szCs w:val="20"/>
-              </w:rPr>
-            </w:r>
-            <w:r>
-              <w:rPr>
-                <w:sz w:val="20"/>
-                <w:szCs w:val="20"/>
-              </w:rPr>
+              <w:t xml:space="preserve">La dependencia del dominio definitivo se mitiga contratándolo al inicio de la fase de despliegue; la ausencia de una automotora real en esta etapa se mitiga validando el sistema con la automotora de demostración mediante pruebas de aceptación.</w:t>
             </w:r>
           </w:p>
         </w:tc>
@@ -3245,25 +2621,7 @@
                 <w:sz w:val="20"/>
                 <w:szCs w:val="20"/>
               </w:rPr>
-            </w:r>
-            <w:r>
-              <w:rPr>
-                <w:sz w:val="20"/>
-                <w:szCs w:val="20"/>
-              </w:rPr>
-              <w:t xml:space="preserve">Desarrollar una plataforma híbrida de punto de venta con un módulo de análisis e inteligencia de ventas local y sincronización asíncrona a la nube.</w:t>
-            </w:r>
-            <w:r>
-              <w:rPr>
-                <w:sz w:val="20"/>
-                <w:szCs w:val="20"/>
-              </w:rPr>
-            </w:r>
-            <w:r>
-              <w:rPr>
-                <w:sz w:val="20"/>
-                <w:szCs w:val="20"/>
-              </w:rPr>
+              <w:t xml:space="preserve">Desarrollar una plataforma web multi-empresa que centralice la gestión comercial de automotoras y publique automáticamente su inventario en una vitrina propia y en un marketplace común.</w:t>
             </w:r>
           </w:p>
         </w:tc>
@@ -3332,62 +2690,7 @@
                 <w:sz w:val="20"/>
                 <w:szCs w:val="20"/>
               </w:rPr>
-            </w:r>
-            <w:r>
-              <w:rPr>
-                <w:sz w:val="20"/>
-                <w:szCs w:val="20"/>
-              </w:rPr>
-              <w:t xml:space="preserve">Centralizar la operación del punto de venta en una plataforma única, procesando el 100% de las operaciones diarias de cobro, arqueo de caja y control de inventario local, registrando y emitiendo al menos </w:t>
-            </w:r>
-            <w:r>
-              <w:rPr>
-                <w:sz w:val="20"/>
-                <w:szCs w:val="20"/>
-                <w:lang w:val="es-ES"/>
-              </w:rPr>
-              <w:t xml:space="preserve">1000</w:t>
-            </w:r>
-            <w:r>
-              <w:rPr>
-                <w:sz w:val="20"/>
-                <w:szCs w:val="20"/>
-              </w:rPr>
-              <w:t xml:space="preserve"> comprobantes de venta contin</w:t>
-            </w:r>
-            <w:r>
-              <w:rPr>
-                <w:sz w:val="20"/>
-                <w:szCs w:val="20"/>
-              </w:rPr>
-              <w:t xml:space="preserve">uos en el comercio cliente dentro de las primeras </w:t>
-            </w:r>
-            <w:r>
-              <w:rPr>
-                <w:sz w:val="20"/>
-                <w:szCs w:val="20"/>
-                <w:lang w:val="es-ES"/>
-              </w:rPr>
-              <w:t xml:space="preserve">5</w:t>
-            </w:r>
-            <w:r>
-              <w:rPr>
-                <w:sz w:val="20"/>
-                <w:szCs w:val="20"/>
-              </w:rPr>
-              <w:t xml:space="preserve"> semanas de desarrollo del proyecto.  </w:t>
-            </w:r>
-            <w:r>
-              <w:rPr>
-                <w:sz w:val="20"/>
-                <w:szCs w:val="20"/>
-              </w:rPr>
-            </w:r>
-            <w:r>
-              <w:rPr>
-                <w:sz w:val="20"/>
-                <w:szCs w:val="20"/>
-              </w:rPr>
+              <w:t xml:space="preserve">Centralizar la gestión comercial interna de la automotora, implementando los 18 módulos del sistema y demostrando en la automotora de demostración el ciclo completo vehículo, cotización, reserva y venta con comprobante en PDF, registrando al menos 30 vehículos y 20 documentos comerciales con folio correlativo dentro de las primeras 10 semanas del proyecto.</w:t>
             </w:r>
           </w:p>
           <w:p>
@@ -3411,26 +2714,7 @@
                 <w:sz w:val="20"/>
                 <w:szCs w:val="20"/>
               </w:rPr>
-              <w:t xml:space="preserve">Asegurar la continuidad operativa del local frente a contingencias de red, logrando una tasa del 0% de interrupciones en la atención en caja durante jornadas completas </w:t>
-            </w:r>
-            <w:r>
-              <w:rPr>
-                <w:sz w:val="20"/>
-                <w:szCs w:val="20"/>
-              </w:rPr>
-              <w:t xml:space="preserve">de venta sin conexión a Internet, mediante una arquitectura de escritorio offline-first con persistencia local.  </w:t>
-            </w:r>
-            <w:r>
-              <w:rPr>
-                <w:sz w:val="20"/>
-                <w:szCs w:val="20"/>
-              </w:rPr>
-            </w:r>
-            <w:r>
-              <w:rPr>
-                <w:sz w:val="20"/>
-                <w:szCs w:val="20"/>
-              </w:rPr>
+              <w:t xml:space="preserve">Publicar automáticamente la oferta en la vitrina propia y en el marketplace, verificando que el 100 % de los vehículos en estado disponible aparezca en ambos canales sin exponer datos internos (patente, costos o consignación), con al menos dos automotoras de prueba, dentro de 10 semanas.</w:t>
             </w:r>
           </w:p>
           <w:p>
@@ -3454,56 +2738,7 @@
                 <w:sz w:val="20"/>
                 <w:szCs w:val="20"/>
               </w:rPr>
-              <w:t xml:space="preserve">Identificar oportunidades de negocio mediante minería de datos transaccional, descubriendo al menos </w:t>
-            </w:r>
-            <w:r>
-              <w:rPr>
-                <w:sz w:val="20"/>
-                <w:szCs w:val="20"/>
-                <w:lang w:val="es-ES"/>
-              </w:rPr>
-              <w:t xml:space="preserve">5</w:t>
-            </w:r>
-            <w:r>
-              <w:rPr>
-                <w:sz w:val="20"/>
-                <w:szCs w:val="20"/>
-              </w:rPr>
-              <w:t xml:space="preserve"> reglas de compra cruzada entre productos y</w:t>
-            </w:r>
-            <w:r>
-              <w:rPr>
-                <w:sz w:val="20"/>
-                <w:szCs w:val="20"/>
-              </w:rPr>
-              <w:t xml:space="preserve"> patrones de demanda horaria para presentar un reporte comercial dentro de 1</w:t>
-            </w:r>
-            <w:r>
-              <w:rPr>
-                <w:sz w:val="20"/>
-                <w:szCs w:val="20"/>
-                <w:lang w:val="es-ES"/>
-              </w:rPr>
-              <w:t xml:space="preserve">0</w:t>
-            </w:r>
-            <w:r>
-              <w:rPr>
-                <w:sz w:val="20"/>
-                <w:szCs w:val="20"/>
-              </w:rPr>
-              <w:t xml:space="preserve"> semanas, evidenciando al menos una promoción comercial o reubicación de productos implementada en el local a partir de dichos resultados.  </w:t>
-            </w:r>
-            <w:r>
-              <w:rPr>
-                <w:sz w:val="20"/>
-                <w:szCs w:val="20"/>
-              </w:rPr>
-            </w:r>
-            <w:r>
-              <w:rPr>
-                <w:sz w:val="20"/>
-                <w:szCs w:val="20"/>
-              </w:rPr>
+              <w:t xml:space="preserve">Entregar indicadores para la toma de decisiones, disponiendo de un dashboard y un módulo de analítica con al menos 10 indicadores (utilidad neta, margen por auto, ticket promedio, días hasta vender, autos estancados, entre otros) contrastados con un cálculo manual sobre los datos de prueba sin diferencias, dentro de 10 semanas.</w:t>
             </w:r>
           </w:p>
           <w:p>
@@ -3527,70 +2762,8 @@
                 <w:sz w:val="20"/>
                 <w:szCs w:val="20"/>
               </w:rPr>
-              <w:t xml:space="preserve">Optimizar la gestión y reposición de inv</w:t>
+              <w:t xml:space="preserve">Asegurar la calidad, la seguridad y la puesta en producción, manteniendo aprobadas al menos 163 pruebas automatizadas, comprobando el aislamiento de datos entre automotoras y sucursales y el control de acceso por rol, y desplegando el sistema con HTTPS y respaldo diario dentro de 12 semanas.</w:t>
             </w:r>
-            <w:r>
-              <w:rPr>
-                <w:sz w:val="20"/>
-                <w:szCs w:val="20"/>
-              </w:rPr>
-              <w:t xml:space="preserve">e</w:t>
-            </w:r>
-            <w:r>
-              <w:rPr>
-                <w:sz w:val="20"/>
-                <w:szCs w:val="20"/>
-              </w:rPr>
-              <w:t xml:space="preserve">ntario, reduciendo las situaciones de quiebre de stock mediante un módulo de diagnóstico automático que emita alertas preventivas sobre productos críticos, alcanzando al menos un 85% de precisión en las sugerencias de compra validadas junto al comerciante </w:t>
-            </w:r>
-            <w:r>
-              <w:rPr>
-                <w:sz w:val="20"/>
-                <w:szCs w:val="20"/>
-              </w:rPr>
-              <w:t xml:space="preserve">dentro de 12 semanas.  </w:t>
-            </w:r>
-            <w:r>
-              <w:rPr>
-                <w:sz w:val="20"/>
-                <w:szCs w:val="20"/>
-              </w:rPr>
-            </w:r>
-            <w:r>
-              <w:rPr>
-                <w:sz w:val="20"/>
-                <w:szCs w:val="20"/>
-              </w:rPr>
-            </w:r>
-          </w:p>
-          <w:p>
-            <w:pPr>
-              <w:pStyle w:val="1006"/>
-              <w:numPr>
-                <w:ilvl w:val="0"/>
-                <w:numId w:val="13"/>
-              </w:numPr>
-              <w:pBdr/>
-              <w:spacing w:after="0" w:before="200"/>
-              <w:ind/>
-              <w:jc w:val="both"/>
-              <w:rPr/>
-            </w:pPr>
-            <w:r>
-              <w:rPr>
-                <w:sz w:val="20"/>
-                <w:szCs w:val="20"/>
-              </w:rPr>
-              <w:t xml:space="preserve">Habilitar la supervisión remota y consistencia de datos en la nube, logrando el 100% de sincronización e integridad transaccional (cero registros duplicados o perdidos) entre la terminal de mostrador y el panel web móvil del propietar</w:t>
-            </w:r>
-            <w:r>
-              <w:rPr>
-                <w:sz w:val="20"/>
-                <w:szCs w:val="20"/>
-              </w:rPr>
-              <w:t xml:space="preserve">io en al menos 15 jornadas operativas continuas antes de finalizar el semestre académico.  </w:t>
-            </w:r>
-            <w:r/>
           </w:p>
         </w:tc>
       </w:tr>
@@ -4153,39 +3326,7 @@
                 <w:sz w:val="20"/>
                 <w:szCs w:val="20"/>
               </w:rPr>
-            </w:r>
-            <w:r>
-              <w:rPr>
-                <w:sz w:val="20"/>
-                <w:szCs w:val="20"/>
-              </w:rPr>
-              <w:t xml:space="preserve">P</w:t>
-            </w:r>
-            <w:r>
-              <w:rPr>
-                <w:sz w:val="20"/>
-                <w:szCs w:val="20"/>
-              </w:rPr>
-              <w:t xml:space="preserve">ara llevar a cabo el proyecto dentro de las 14 semanas disponibles se adoptará una metodología ágil fundamentada en el marco Scrum puro, estructurada en 7 Sprints quincenales. Este modelo iterativo e incremental fue seleccionado debido a que permite desple</w:t>
-            </w:r>
-            <w:r>
-              <w:rPr>
-                <w:sz w:val="20"/>
-                <w:szCs w:val="20"/>
-              </w:rPr>
-              <w:t xml:space="preserve">gar entregas de software funcionales y testeables de manera temprana, facilitando la retroalimentación directa de los comerciantes en su lugar de trabajo y habilitando la adaptación rápida del diseño sin desviar los plazos de entrega.  </w:t>
-            </w:r>
-            <w:r>
-              <w:rPr>
-                <w:sz w:val="20"/>
-                <w:szCs w:val="20"/>
-              </w:rPr>
-            </w:r>
-            <w:r>
-              <w:rPr>
-                <w:sz w:val="20"/>
-                <w:szCs w:val="20"/>
-              </w:rPr>
+              <w:t xml:space="preserve">Para llevar a cabo el proyecto dentro de las 14 semanas disponibles se adoptará una metodología tradicional basada en el modelo en cascada, estructurada en cinco fases secuenciales. Este modelo fue seleccionado porque los requisitos del sistema están definidos y documentados en detalle (18 módulos con sus reglas de negocio, modelo de datos, arquitectura y seguridad) y el alcance está acotado mediante decisiones de diseño explícitas, lo que permite planificar con precisión, controlar el avance mediante entregables formales y mantener la trazabilidad entre requisitos, diseño, código y pruebas.</w:t>
             </w:r>
           </w:p>
           <w:p>
@@ -4204,26 +3345,7 @@
                 <w:sz w:val="20"/>
                 <w:szCs w:val="20"/>
               </w:rPr>
-              <w:t xml:space="preserve">El proceso de trabajo</w:t>
-            </w:r>
-            <w:r>
-              <w:rPr>
-                <w:sz w:val="20"/>
-                <w:szCs w:val="20"/>
-              </w:rPr>
-              <w:t xml:space="preserve"> se estructura mediante los siguientes componentes:</w:t>
-            </w:r>
-            <w:r>
-              <w:rPr>
-                <w:sz w:val="20"/>
-                <w:szCs w:val="20"/>
-              </w:rPr>
-            </w:r>
-            <w:r>
-              <w:rPr>
-                <w:sz w:val="20"/>
-                <w:szCs w:val="20"/>
-              </w:rPr>
+              <w:t xml:space="preserve">El proceso de trabajo se estructura mediante los siguientes componentes:</w:t>
             </w:r>
           </w:p>
           <w:p>
@@ -4239,29 +3361,18 @@
             </w:pPr>
             <w:r>
               <w:rPr>
+                <w:b/>
                 <w:sz w:val="20"/>
                 <w:szCs w:val="20"/>
               </w:rPr>
-              <w:t xml:space="preserve">Sprints quincenales (15 días): Cada ciclo fija un objetivo técnico cerrado y medible orientado a dejar un módulo operativo (iniciando por la arquitectura de datos y la terminal de ventas, seguido por el mot</w:t>
+              <w:t xml:space="preserve">Fases secuenciales: </w:t>
             </w:r>
             <w:r>
               <w:rPr>
                 <w:sz w:val="20"/>
                 <w:szCs w:val="20"/>
               </w:rPr>
-              <w:t xml:space="preserve">or analítico de datos y finalizando con la replicación cloud y el dashboard móvil).  </w:t>
-            </w:r>
-            <w:r>
-              <w:rPr>
-                <w:sz w:val="20"/>
-                <w:szCs w:val="20"/>
-              </w:rPr>
-            </w:r>
-            <w:r>
-              <w:rPr>
-                <w:sz w:val="20"/>
-                <w:szCs w:val="20"/>
-              </w:rPr>
+              <w:t xml:space="preserve">análisis y requisitos, diseño, implementación, pruebas, y despliegue y cierre. Una fase no comienza hasta que la anterior ha sido completada y aprobada.</w:t>
             </w:r>
           </w:p>
           <w:p>
@@ -4277,29 +3388,18 @@
             </w:pPr>
             <w:r>
               <w:rPr>
+                <w:b/>
                 <w:sz w:val="20"/>
                 <w:szCs w:val="20"/>
               </w:rPr>
-              <w:t xml:space="preserve">Product Backlog priorizado por valor de negocio: Las funcionalidades se redactan como historias de usuario agrupadas según los roles de operación (cajero, administrador de </w:t>
+              <w:t xml:space="preserve">Entregable formal por fase: </w:t>
             </w:r>
             <w:r>
               <w:rPr>
                 <w:sz w:val="20"/>
                 <w:szCs w:val="20"/>
               </w:rPr>
-              <w:t xml:space="preserve">local y dueño supervisor). La priorización sitúa en los primeros ciclos las tareas críticas para la continuidad de venta en mostrador.  </w:t>
-            </w:r>
-            <w:r>
-              <w:rPr>
-                <w:sz w:val="20"/>
-                <w:szCs w:val="20"/>
-              </w:rPr>
-            </w:r>
-            <w:r>
-              <w:rPr>
-                <w:sz w:val="20"/>
-                <w:szCs w:val="20"/>
-              </w:rPr>
+              <w:t xml:space="preserve">cada fase produce un documento o producto verificable (especificación de requisitos, modelo de datos y arquitectura, código fuente, informe de pruebas, sistema desplegado y manuales) que sirve de base para la fase siguiente.</w:t>
             </w:r>
           </w:p>
           <w:p>
@@ -4315,44 +3415,18 @@
             </w:pPr>
             <w:r>
               <w:rPr>
+                <w:b/>
                 <w:sz w:val="20"/>
                 <w:szCs w:val="20"/>
               </w:rPr>
-              <w:t xml:space="preserve">Ceremonias ágiles y control continuo: Al inicio de cada sprint se realiza la sesión de planificación; periódicamente se e</w:t>
+              <w:t xml:space="preserve">Hitos de control y aprobación: </w:t>
             </w:r>
             <w:r>
               <w:rPr>
                 <w:sz w:val="20"/>
                 <w:szCs w:val="20"/>
               </w:rPr>
-              <w:t xml:space="preserve">jecutan revisiones técnicas de sincronización y resolución de bloqueos, finalizando con una revisión funciona</w:t>
-            </w:r>
-            <w:r>
-              <w:rPr>
-                <w:sz w:val="20"/>
-                <w:szCs w:val="20"/>
-                <w:lang w:val="es-ES"/>
-              </w:rPr>
-              <w:t xml:space="preserve">l</w:t>
-            </w:r>
-            <w:r>
-              <w:rPr>
-                <w:sz w:val="20"/>
-                <w:szCs w:val="20"/>
-              </w:rPr>
-              <w:t xml:space="preserve"> junto al comerciante y una retrospectiva interna.  </w:t>
-            </w:r>
-            <w:r>
-              <w:rPr>
-                <w:sz w:val="20"/>
-                <w:szCs w:val="20"/>
-              </w:rPr>
-            </w:r>
-            <w:r>
-              <w:rPr>
-                <w:sz w:val="20"/>
-                <w:szCs w:val="20"/>
-              </w:rPr>
+              <w:t xml:space="preserve">al término de cada fase se revisa formalmente el entregable frente a los criterios definidos; solo con su aprobación se avanza, lo que permite detectar desviaciones tempranamente.</w:t>
             </w:r>
           </w:p>
           <w:p>
@@ -4368,22 +3442,18 @@
             </w:pPr>
             <w:r>
               <w:rPr>
+                <w:b/>
                 <w:sz w:val="20"/>
                 <w:szCs w:val="20"/>
               </w:rPr>
-              <w:t xml:space="preserve">Distribución de Funciones y Responsabilidades:</w:t>
+              <w:t xml:space="preserve">Requisitos congelados y control de cambios: </w:t>
             </w:r>
             <w:r>
               <w:rPr>
                 <w:sz w:val="20"/>
                 <w:szCs w:val="20"/>
               </w:rPr>
-            </w:r>
-            <w:r>
-              <w:rPr>
-                <w:sz w:val="20"/>
-                <w:szCs w:val="20"/>
-              </w:rPr>
+              <w:t xml:space="preserve">los requisitos se consolidan al cierre de la fase de análisis; cualquier cambio posterior se evalúa por su impacto en alcance, plazo y diseño, y queda registrado en la documentación.</w:t>
             </w:r>
           </w:p>
           <w:p>
@@ -4399,37 +3469,18 @@
             </w:pPr>
             <w:r>
               <w:rPr>
+                <w:b/>
                 <w:sz w:val="20"/>
                 <w:szCs w:val="20"/>
               </w:rPr>
-              <w:t xml:space="preserve">Joaquin Cabrera (Líder Técnico / </w:t>
+              <w:t xml:space="preserve">Documentación continua: </w:t>
             </w:r>
             <w:r>
               <w:rPr>
                 <w:sz w:val="20"/>
                 <w:szCs w:val="20"/>
               </w:rPr>
-              <w:t xml:space="preserve">Desarrollador Principal): Arquitectura de software, diseño e implementación del modelo relacional (local y cloud), desarrollo del motor de minería de datos y servicios de sincronización asíncrona</w:t>
-            </w:r>
-            <w:r>
-              <w:rPr>
-                <w:sz w:val="20"/>
-                <w:szCs w:val="20"/>
-                <w:lang w:val="es-ES"/>
-              </w:rPr>
-              <w:t xml:space="preserve">.</w:t>
-            </w:r>
-            <w:r>
-              <w:rPr>
-                <w:sz w:val="20"/>
-                <w:szCs w:val="20"/>
-              </w:rPr>
-            </w:r>
-            <w:r>
-              <w:rPr>
-                <w:sz w:val="20"/>
-                <w:szCs w:val="20"/>
-              </w:rPr>
+              <w:t xml:space="preserve">la documentación técnica y funcional se mantiene en el repositorio junto al código y se actualiza al cierre de cada fase.</w:t>
             </w:r>
           </w:p>
           <w:p>
@@ -4445,67 +3496,18 @@
             </w:pPr>
             <w:r>
               <w:rPr>
+                <w:b/>
                 <w:sz w:val="20"/>
                 <w:szCs w:val="20"/>
               </w:rPr>
-              <w:t xml:space="preserve">Sebastián Quilodran (Desarrollador de Mó</w:t>
+              <w:t xml:space="preserve">Distribución de Funciones y Responsabilidades: </w:t>
             </w:r>
             <w:r>
               <w:rPr>
                 <w:sz w:val="20"/>
                 <w:szCs w:val="20"/>
               </w:rPr>
-              <w:t xml:space="preserve">dulos / Control de Integración): Construcción y pruebas de la interfaz de usuario de mostrador, integración de periféricos físicos  y codificación de vistas del panel web responsivo.</w:t>
-            </w:r>
-            <w:r>
-              <w:rPr>
-                <w:sz w:val="20"/>
-                <w:szCs w:val="20"/>
-              </w:rPr>
-            </w:r>
-            <w:r>
-              <w:rPr>
-                <w:sz w:val="20"/>
-                <w:szCs w:val="20"/>
-              </w:rPr>
-            </w:r>
-          </w:p>
-          <w:p>
-            <w:pPr>
-              <w:pBdr/>
-              <w:spacing w:after="240" w:before="240"/>
-              <w:ind/>
-              <w:jc w:val="both"/>
-              <w:rPr>
-                <w:sz w:val="20"/>
-                <w:szCs w:val="20"/>
-              </w:rPr>
-            </w:pPr>
-            <w:r>
-              <w:rPr>
-                <w:sz w:val="20"/>
-                <w:szCs w:val="20"/>
-              </w:rPr>
-              <w:t xml:space="preserve">Brayan Cid (Aseguramiento de Calidad </w:t>
-            </w:r>
-            <w:r>
-              <w:rPr>
-                <w:sz w:val="20"/>
-                <w:szCs w:val="20"/>
-              </w:rPr>
-              <w:t xml:space="preserve">y Gestión de Requerimientos): Levantamiento y refinamiento de historias de usuario con los comerciantes clientes, diseño y ejecución de casos de prueba y elaboración de manuales de usuario.</w:t>
-            </w:r>
-            <w:r>
-              <w:rPr>
-                <w:sz w:val="20"/>
-                <w:szCs w:val="20"/>
-              </w:rPr>
-            </w:r>
-            <w:r>
-              <w:rPr>
-                <w:sz w:val="20"/>
-                <w:szCs w:val="20"/>
-              </w:rPr>
+              <w:t xml:space="preserve">Joaquín Cabrera (Desarrollador Full Stack y Gestor del Proyecto) es responsable de todas las fases: levantamiento y especificación de requisitos, diseño del modelo de datos y de la arquitectura, implementación de la API, el panel de gestión y el sitio público, ejecución de pruebas, despliegue y elaboración de manuales y memoria.</w:t>
             </w:r>
           </w:p>
         </w:tc>
@@ -5045,18 +4047,6 @@
               </w:rPr>
               <w:t xml:space="preserve">Avance</w:t>
             </w:r>
-            <w:r>
-              <w:rPr>
-                <w:sz w:val="20"/>
-                <w:szCs w:val="20"/>
-              </w:rPr>
-            </w:r>
-            <w:r>
-              <w:rPr>
-                <w:sz w:val="20"/>
-                <w:szCs w:val="20"/>
-              </w:rPr>
-            </w:r>
           </w:p>
         </w:tc>
         <w:tc>
@@ -5084,40 +4074,7 @@
                 <w:sz w:val="20"/>
                 <w:szCs w:val="20"/>
               </w:rPr>
-            </w:r>
-            <w:r>
-              <w:rPr>
-                <w:sz w:val="20"/>
-                <w:szCs w:val="20"/>
-              </w:rPr>
-              <w:t xml:space="preserve">Product Backlog y Documento</w:t>
-            </w:r>
-            <w:r>
-              <w:rPr>
-                <w:sz w:val="20"/>
-                <w:szCs w:val="20"/>
-                <w:lang w:val="es-ES"/>
-              </w:rPr>
-              <w:t xml:space="preserve"> </w:t>
-            </w:r>
-            <w:r>
-              <w:rPr>
-                <w:sz w:val="20"/>
-                <w:szCs w:val="20"/>
-              </w:rPr>
-              <w:t xml:space="preserve">de Requerimientos</w:t>
-            </w:r>
-            <w:r>
-              <w:rPr>
-                <w:sz w:val="20"/>
-                <w:szCs w:val="20"/>
-              </w:rPr>
-            </w:r>
-            <w:r>
-              <w:rPr>
-                <w:sz w:val="20"/>
-                <w:szCs w:val="20"/>
-              </w:rPr>
+              <w:t xml:space="preserve">Especificación de Requisitos</w:t>
             </w:r>
           </w:p>
         </w:tc>
@@ -5152,25 +4109,7 @@
                 <w:sz w:val="20"/>
                 <w:szCs w:val="20"/>
               </w:rPr>
-            </w:r>
-            <w:r>
-              <w:rPr>
-                <w:sz w:val="20"/>
-                <w:szCs w:val="20"/>
-              </w:rPr>
-              <w:t xml:space="preserve">Documento de requerimientos funcionales y no funcionales estructurado en historias de usuario con criterios de aceptación formalizados.</w:t>
-            </w:r>
-            <w:r>
-              <w:rPr>
-                <w:sz w:val="20"/>
-                <w:szCs w:val="20"/>
-              </w:rPr>
-            </w:r>
-            <w:r>
-              <w:rPr>
-                <w:sz w:val="20"/>
-                <w:szCs w:val="20"/>
-              </w:rPr>
+              <w:t xml:space="preserve">Documento de los 18 módulos funcionales con actores, roles, reglas de negocio y decisiones de alcance.</w:t>
             </w:r>
           </w:p>
         </w:tc>
@@ -5205,25 +4144,7 @@
                 <w:sz w:val="20"/>
                 <w:szCs w:val="20"/>
               </w:rPr>
-            </w:r>
-            <w:r>
-              <w:rPr>
-                <w:sz w:val="20"/>
-                <w:szCs w:val="20"/>
-              </w:rPr>
-              <w:t xml:space="preserve">Permite acreditar la planificación del alcance y la priorización de funcionalidades orientadas a resolver las necesidades de los comerciantes.</w:t>
-            </w:r>
-            <w:r>
-              <w:rPr>
-                <w:sz w:val="20"/>
-                <w:szCs w:val="20"/>
-              </w:rPr>
-            </w:r>
-            <w:r>
-              <w:rPr>
-                <w:sz w:val="20"/>
-                <w:szCs w:val="20"/>
-              </w:rPr>
+              <w:t xml:space="preserve">Acredita la planificación del alcance y la definición formal de los requisitos antes de la construcción.</w:t>
             </w:r>
           </w:p>
         </w:tc>
@@ -5265,18 +4186,6 @@
               </w:rPr>
               <w:t xml:space="preserve">Avance</w:t>
             </w:r>
-            <w:r>
-              <w:rPr>
-                <w:sz w:val="20"/>
-                <w:szCs w:val="20"/>
-              </w:rPr>
-            </w:r>
-            <w:r>
-              <w:rPr>
-                <w:sz w:val="20"/>
-                <w:szCs w:val="20"/>
-              </w:rPr>
-            </w:r>
           </w:p>
         </w:tc>
         <w:tc>
@@ -5304,25 +4213,7 @@
                 <w:sz w:val="20"/>
                 <w:szCs w:val="20"/>
               </w:rPr>
-            </w:r>
-            <w:r>
-              <w:rPr>
-                <w:sz w:val="20"/>
-                <w:szCs w:val="20"/>
-              </w:rPr>
-              <w:t xml:space="preserve">Modelo de Datos y Arquitectura de Software</w:t>
-            </w:r>
-            <w:r>
-              <w:rPr>
-                <w:sz w:val="20"/>
-                <w:szCs w:val="20"/>
-              </w:rPr>
-            </w:r>
-            <w:r>
-              <w:rPr>
-                <w:sz w:val="20"/>
-                <w:szCs w:val="20"/>
-              </w:rPr>
+              <w:t xml:space="preserve">Modelo de Datos y Arquitectura</w:t>
             </w:r>
           </w:p>
         </w:tc>
@@ -5357,25 +4248,7 @@
                 <w:sz w:val="20"/>
                 <w:szCs w:val="20"/>
               </w:rPr>
-            </w:r>
-            <w:r>
-              <w:rPr>
-                <w:sz w:val="20"/>
-                <w:szCs w:val="20"/>
-              </w:rPr>
-              <w:t xml:space="preserve">Diagramas entidad-relación normalizados (bases local y cloud), esquemas de tablas y diagramas de arquitectura en bloques.</w:t>
-            </w:r>
-            <w:r>
-              <w:rPr>
-                <w:sz w:val="20"/>
-                <w:szCs w:val="20"/>
-              </w:rPr>
-            </w:r>
-            <w:r>
-              <w:rPr>
-                <w:sz w:val="20"/>
-                <w:szCs w:val="20"/>
-              </w:rPr>
+              <w:t xml:space="preserve">Esquema relacional de 23 tablas (schema.sql), diagramas entidad-relación y esquema de interacción entre las tres aplicaciones, la base de datos y los servicios externos.</w:t>
             </w:r>
           </w:p>
         </w:tc>
@@ -5410,25 +4283,7 @@
                 <w:sz w:val="20"/>
                 <w:szCs w:val="20"/>
               </w:rPr>
-            </w:r>
-            <w:r>
-              <w:rPr>
-                <w:sz w:val="20"/>
-                <w:szCs w:val="20"/>
-              </w:rPr>
-              <w:t xml:space="preserve">Evidencia la correcta estructuración relacional y la resiliencia del sistema distribuido antes de la codificación masiva.</w:t>
-            </w:r>
-            <w:r>
-              <w:rPr>
-                <w:sz w:val="20"/>
-                <w:szCs w:val="20"/>
-              </w:rPr>
-            </w:r>
-            <w:r>
-              <w:rPr>
-                <w:sz w:val="20"/>
-                <w:szCs w:val="20"/>
-              </w:rPr>
+              <w:t xml:space="preserve">Evidencia la correcta estructuración relacional y el diseño multi-empresa antes de la codificación.</w:t>
             </w:r>
           </w:p>
         </w:tc>
@@ -5470,18 +4325,6 @@
               </w:rPr>
               <w:t xml:space="preserve">Avance</w:t>
             </w:r>
-            <w:r>
-              <w:rPr>
-                <w:sz w:val="20"/>
-                <w:szCs w:val="20"/>
-              </w:rPr>
-            </w:r>
-            <w:r>
-              <w:rPr>
-                <w:sz w:val="20"/>
-                <w:szCs w:val="20"/>
-              </w:rPr>
-            </w:r>
           </w:p>
         </w:tc>
         <w:tc>
@@ -5515,25 +4358,7 @@
                 <w:sz w:val="20"/>
                 <w:szCs w:val="20"/>
               </w:rPr>
-            </w:r>
-            <w:r>
-              <w:rPr>
-                <w:sz w:val="20"/>
-                <w:szCs w:val="20"/>
-              </w:rPr>
-              <w:t xml:space="preserve">Código de Terminal POS de Mostrador (MVP)</w:t>
-            </w:r>
-            <w:r>
-              <w:rPr>
-                <w:sz w:val="20"/>
-                <w:szCs w:val="20"/>
-              </w:rPr>
-            </w:r>
-            <w:r>
-              <w:rPr>
-                <w:sz w:val="20"/>
-                <w:szCs w:val="20"/>
-              </w:rPr>
+              <w:t xml:space="preserve">Diseño de Seguridad y Autenticación</w:t>
             </w:r>
           </w:p>
         </w:tc>
@@ -5568,33 +4393,7 @@
                 <w:sz w:val="20"/>
                 <w:szCs w:val="20"/>
               </w:rPr>
-            </w:r>
-            <w:r>
-              <w:rPr>
-                <w:sz w:val="20"/>
-                <w:szCs w:val="20"/>
-              </w:rPr>
-              <w:t xml:space="preserve">Repositorio de código fuente con los módulos de venta rápida, catálogo de productos, control de inventario local, arqueo de turnos y administración de clientes, junto con la integración de periféricos de caja</w:t>
-            </w:r>
-            <w:r>
-              <w:rPr>
-                <w:sz w:val="20"/>
-                <w:szCs w:val="20"/>
-                <w:lang w:val="es-ES"/>
-              </w:rPr>
-              <w:t xml:space="preserve">.</w:t>
-            </w:r>
-            <w:r>
-              <w:rPr>
-                <w:sz w:val="20"/>
-                <w:szCs w:val="20"/>
-              </w:rPr>
-            </w:r>
-            <w:r>
-              <w:rPr>
-                <w:sz w:val="20"/>
-                <w:szCs w:val="20"/>
-              </w:rPr>
+              <w:t xml:space="preserve">Documento con los flujos de sesión, control de acceso por rol y alcance, protección CSRF y manejo de archivos.</w:t>
             </w:r>
           </w:p>
         </w:tc>
@@ -5629,40 +4428,7 @@
                 <w:sz w:val="20"/>
                 <w:szCs w:val="20"/>
               </w:rPr>
-            </w:r>
-            <w:r>
-              <w:rPr>
-                <w:sz w:val="20"/>
-                <w:szCs w:val="20"/>
-              </w:rPr>
-              <w:t xml:space="preserve">Da cuenta del funcionamiento</w:t>
-            </w:r>
-            <w:r>
-              <w:rPr>
-                <w:sz w:val="20"/>
-                <w:szCs w:val="20"/>
-                <w:lang w:val="es-ES"/>
-              </w:rPr>
-              <w:t xml:space="preserve"> </w:t>
-            </w:r>
-            <w:r>
-              <w:rPr>
-                <w:sz w:val="20"/>
-                <w:szCs w:val="20"/>
-              </w:rPr>
-              <w:t xml:space="preserve">y operatividad de la terminal base, capaz de asegurar el cobro, la gestión del inventario y la continuidad operativa del negocio sin depender de conexión a Internet.</w:t>
-            </w:r>
-            <w:r>
-              <w:rPr>
-                <w:sz w:val="20"/>
-                <w:szCs w:val="20"/>
-              </w:rPr>
-            </w:r>
-            <w:r>
-              <w:rPr>
-                <w:sz w:val="20"/>
-                <w:szCs w:val="20"/>
-              </w:rPr>
+              <w:t xml:space="preserve">Demuestra que la seguridad se define desde el diseño y no como un agregado posterior.</w:t>
             </w:r>
           </w:p>
         </w:tc>
@@ -5703,20 +4469,7 @@
                 <w:szCs w:val="20"/>
                 <w:lang w:val="es-ES"/>
               </w:rPr>
-              <w:t xml:space="preserve">Final
-</w:t>
-            </w:r>
-            <w:r>
-              <w:rPr>
-                <w:sz w:val="20"/>
-                <w:szCs w:val="20"/>
-              </w:rPr>
-            </w:r>
-            <w:r>
-              <w:rPr>
-                <w:sz w:val="20"/>
-                <w:szCs w:val="20"/>
-              </w:rPr>
+              <w:t xml:space="preserve">Final</w:t>
             </w:r>
           </w:p>
         </w:tc>
@@ -5751,25 +4504,7 @@
                 <w:sz w:val="20"/>
                 <w:szCs w:val="20"/>
               </w:rPr>
-            </w:r>
-            <w:r>
-              <w:rPr>
-                <w:sz w:val="20"/>
-                <w:szCs w:val="20"/>
-              </w:rPr>
-              <w:t xml:space="preserve">Módulo de Inteligencia de Ventas y Analítica</w:t>
-            </w:r>
-            <w:r>
-              <w:rPr>
-                <w:sz w:val="20"/>
-                <w:szCs w:val="20"/>
-              </w:rPr>
-            </w:r>
-            <w:r>
-              <w:rPr>
-                <w:sz w:val="20"/>
-                <w:szCs w:val="20"/>
-              </w:rPr>
+              <w:t xml:space="preserve">Código Fuente del Sistema</w:t>
             </w:r>
           </w:p>
         </w:tc>
@@ -5798,65 +4533,7 @@
                 <w:sz w:val="20"/>
                 <w:szCs w:val="20"/>
               </w:rPr>
-            </w:r>
-            <w:r>
-              <w:rPr>
-                <w:sz w:val="20"/>
-                <w:szCs w:val="20"/>
-              </w:rPr>
-              <w:t xml:space="preserve">Código fuente y librerías del motor analítico local para cálculo de rentabilidad, detección de compras cruzadas y diagnósticos automáticos.</w:t>
-            </w:r>
-            <w:r>
-              <w:rPr>
-                <w:sz w:val="20"/>
-                <w:szCs w:val="20"/>
-              </w:rPr>
-            </w:r>
-            <w:r>
-              <w:rPr>
-                <w:sz w:val="20"/>
-                <w:szCs w:val="20"/>
-              </w:rPr>
-            </w:r>
-          </w:p>
-          <w:p>
-            <w:pPr>
-              <w:pBdr>
-                <w:top w:val="none" w:color="000000" w:sz="4" w:space="0"/>
-                <w:left w:val="none" w:color="000000" w:sz="4" w:space="0"/>
-                <w:bottom w:val="none" w:color="000000" w:sz="4" w:space="0"/>
-                <w:right w:val="none" w:color="000000" w:sz="4" w:space="0"/>
-                <w:between w:val="none" w:color="000000" w:sz="4" w:space="0"/>
-              </w:pBdr>
-              <w:tabs>
-                <w:tab w:val="center" w:leader="none" w:pos="4419"/>
-                <w:tab w:val="right" w:leader="none" w:pos="8838"/>
-              </w:tabs>
-              <w:spacing w:after="0" w:line="240" w:lineRule="auto"/>
-              <w:ind/>
-              <w:jc w:val="both"/>
-              <w:rPr>
-                <w:sz w:val="20"/>
-                <w:szCs w:val="20"/>
-              </w:rPr>
-            </w:pPr>
-            <w:r>
-              <w:rPr>
-                <w:sz w:val="20"/>
-                <w:szCs w:val="20"/>
-              </w:rPr>
-            </w:r>
-            <w:r>
-              <w:rPr>
-                <w:sz w:val="20"/>
-                <w:szCs w:val="20"/>
-              </w:rPr>
-            </w:r>
-            <w:r>
-              <w:rPr>
-                <w:sz w:val="20"/>
-                <w:szCs w:val="20"/>
-              </w:rPr>
+              <w:t xml:space="preserve">Repositorio con la API, el panel de gestión, el sitio público y el paquete compartido, con historial de commits.</w:t>
             </w:r>
           </w:p>
         </w:tc>
@@ -5885,25 +4562,7 @@
                 <w:sz w:val="20"/>
                 <w:szCs w:val="20"/>
               </w:rPr>
-            </w:r>
-            <w:r>
-              <w:rPr>
-                <w:sz w:val="20"/>
-                <w:szCs w:val="20"/>
-              </w:rPr>
-              <w:t xml:space="preserve">Acredita la integración del factor diferenciador del proyecto y el tratamiento de datos transaccionales brutos.</w:t>
-            </w:r>
-            <w:r>
-              <w:rPr>
-                <w:sz w:val="20"/>
-                <w:szCs w:val="20"/>
-              </w:rPr>
-            </w:r>
-            <w:r>
-              <w:rPr>
-                <w:sz w:val="20"/>
-                <w:szCs w:val="20"/>
-              </w:rPr>
+              <w:t xml:space="preserve">Da cuenta del funcionamiento de los 18 módulos y de la calidad del software construido.</w:t>
             </w:r>
           </w:p>
         </w:tc>
@@ -5945,18 +4604,6 @@
               </w:rPr>
               <w:t xml:space="preserve">Final</w:t>
             </w:r>
-            <w:r>
-              <w:rPr>
-                <w:sz w:val="20"/>
-                <w:szCs w:val="20"/>
-              </w:rPr>
-            </w:r>
-            <w:r>
-              <w:rPr>
-                <w:sz w:val="20"/>
-                <w:szCs w:val="20"/>
-              </w:rPr>
-            </w:r>
           </w:p>
         </w:tc>
         <w:tc>
@@ -5990,25 +4637,7 @@
                 <w:sz w:val="20"/>
                 <w:szCs w:val="20"/>
               </w:rPr>
-            </w:r>
-            <w:r>
-              <w:rPr>
-                <w:sz w:val="20"/>
-                <w:szCs w:val="20"/>
-              </w:rPr>
-              <w:t xml:space="preserve">Servicio de Sincronización y Dashboard Web Móvil</w:t>
-            </w:r>
-            <w:r>
-              <w:rPr>
-                <w:sz w:val="20"/>
-                <w:szCs w:val="20"/>
-              </w:rPr>
-            </w:r>
-            <w:r>
-              <w:rPr>
-                <w:sz w:val="20"/>
-                <w:szCs w:val="20"/>
-              </w:rPr>
+              <w:t xml:space="preserve">Sistema Desplegado en Producción</w:t>
             </w:r>
           </w:p>
         </w:tc>
@@ -6043,25 +4672,7 @@
                 <w:sz w:val="20"/>
                 <w:szCs w:val="20"/>
               </w:rPr>
-            </w:r>
-            <w:r>
-              <w:rPr>
-                <w:sz w:val="20"/>
-                <w:szCs w:val="20"/>
-              </w:rPr>
-              <w:t xml:space="preserve">Servicio en segundo plano para inserción incremental idempotente y panel web responsivo desplegado en entorno de producción.</w:t>
-            </w:r>
-            <w:r>
-              <w:rPr>
-                <w:sz w:val="20"/>
-                <w:szCs w:val="20"/>
-              </w:rPr>
-            </w:r>
-            <w:r>
-              <w:rPr>
-                <w:sz w:val="20"/>
-                <w:szCs w:val="20"/>
-              </w:rPr>
+              <w:t xml:space="preserve">Plataforma disponible con HTTPS en su dominio, con panel de gestión, marketplace y vitrina de la automotora de demostración.</w:t>
             </w:r>
           </w:p>
         </w:tc>
@@ -6096,25 +4707,7 @@
                 <w:sz w:val="20"/>
                 <w:szCs w:val="20"/>
               </w:rPr>
-            </w:r>
-            <w:r>
-              <w:rPr>
-                <w:sz w:val="20"/>
-                <w:szCs w:val="20"/>
-              </w:rPr>
-              <w:t xml:space="preserve">Demuestra la conectividad tolerante a cortes y la capacidad de supervisión remota en tiempo real para el dueño del negocio.</w:t>
-            </w:r>
-            <w:r>
-              <w:rPr>
-                <w:sz w:val="20"/>
-                <w:szCs w:val="20"/>
-              </w:rPr>
-            </w:r>
-            <w:r>
-              <w:rPr>
-                <w:sz w:val="20"/>
-                <w:szCs w:val="20"/>
-              </w:rPr>
+              <w:t xml:space="preserve">Demuestra la puesta en marcha real y la integración del despliegue continuo.</w:t>
             </w:r>
           </w:p>
         </w:tc>
@@ -6156,18 +4749,6 @@
               </w:rPr>
               <w:t xml:space="preserve">Final</w:t>
             </w:r>
-            <w:r>
-              <w:rPr>
-                <w:sz w:val="20"/>
-                <w:szCs w:val="20"/>
-              </w:rPr>
-            </w:r>
-            <w:r>
-              <w:rPr>
-                <w:sz w:val="20"/>
-                <w:szCs w:val="20"/>
-              </w:rPr>
-            </w:r>
           </w:p>
         </w:tc>
         <w:tc>
@@ -6201,25 +4782,7 @@
                 <w:sz w:val="20"/>
                 <w:szCs w:val="20"/>
               </w:rPr>
-            </w:r>
-            <w:r>
-              <w:rPr>
-                <w:sz w:val="20"/>
-                <w:szCs w:val="20"/>
-              </w:rPr>
               <w:t xml:space="preserve">Informe de Pruebas y Certificación</w:t>
-            </w:r>
-            <w:r>
-              <w:rPr>
-                <w:sz w:val="20"/>
-                <w:szCs w:val="20"/>
-              </w:rPr>
-            </w:r>
-            <w:r>
-              <w:rPr>
-                <w:sz w:val="20"/>
-                <w:szCs w:val="20"/>
-              </w:rPr>
             </w:r>
           </w:p>
         </w:tc>
@@ -6254,25 +4817,7 @@
                 <w:sz w:val="20"/>
                 <w:szCs w:val="20"/>
               </w:rPr>
-            </w:r>
-            <w:r>
-              <w:rPr>
-                <w:sz w:val="20"/>
-                <w:szCs w:val="20"/>
-              </w:rPr>
-              <w:t xml:space="preserve">Reporte técnico con matrices de pruebas unitarias, ensayos de estrés con bases de datos volumétricas y pruebas de contingencia por corte de red.</w:t>
-            </w:r>
-            <w:r>
-              <w:rPr>
-                <w:sz w:val="20"/>
-                <w:szCs w:val="20"/>
-              </w:rPr>
-            </w:r>
-            <w:r>
-              <w:rPr>
-                <w:sz w:val="20"/>
-                <w:szCs w:val="20"/>
-              </w:rPr>
+              <w:t xml:space="preserve">Resultados de las pruebas automatizadas, de aislamiento de datos, de seguridad y de aceptación del ciclo comercial completo.</w:t>
             </w:r>
           </w:p>
         </w:tc>
@@ -6307,65 +4852,7 @@
                 <w:sz w:val="20"/>
                 <w:szCs w:val="20"/>
               </w:rPr>
-            </w:r>
-            <w:r>
-              <w:rPr>
-                <w:sz w:val="20"/>
-                <w:szCs w:val="20"/>
-              </w:rPr>
-              <w:t xml:space="preserve">Valida el cumplimiento de estándares disciplinarios, estabilidad operativa y consistencia de los datos en caja.</w:t>
-            </w:r>
-            <w:r>
-              <w:rPr>
-                <w:sz w:val="20"/>
-                <w:szCs w:val="20"/>
-              </w:rPr>
-            </w:r>
-            <w:r>
-              <w:rPr>
-                <w:sz w:val="20"/>
-                <w:szCs w:val="20"/>
-              </w:rPr>
-            </w:r>
-          </w:p>
-          <w:p>
-            <w:pPr>
-              <w:pBdr>
-                <w:top w:val="none" w:color="000000" w:sz="4" w:space="0"/>
-                <w:left w:val="none" w:color="000000" w:sz="4" w:space="0"/>
-                <w:bottom w:val="none" w:color="000000" w:sz="4" w:space="0"/>
-                <w:right w:val="none" w:color="000000" w:sz="4" w:space="0"/>
-                <w:between w:val="none" w:color="000000" w:sz="4" w:space="0"/>
-              </w:pBdr>
-              <w:tabs>
-                <w:tab w:val="center" w:leader="none" w:pos="4419"/>
-                <w:tab w:val="right" w:leader="none" w:pos="8838"/>
-              </w:tabs>
-              <w:spacing w:after="0" w:line="240" w:lineRule="auto"/>
-              <w:ind/>
-              <w:jc w:val="both"/>
-              <w:rPr>
-                <w:sz w:val="20"/>
-                <w:szCs w:val="20"/>
-              </w:rPr>
-            </w:pPr>
-            <w:r>
-              <w:rPr>
-                <w:sz w:val="20"/>
-                <w:szCs w:val="20"/>
-              </w:rPr>
-            </w:r>
-            <w:r>
-              <w:rPr>
-                <w:sz w:val="20"/>
-                <w:szCs w:val="20"/>
-              </w:rPr>
-            </w:r>
-            <w:r>
-              <w:rPr>
-                <w:sz w:val="20"/>
-                <w:szCs w:val="20"/>
-              </w:rPr>
+              <w:t xml:space="preserve">Valida la estabilidad del sistema y el cumplimiento de los objetivos medibles.</w:t>
             </w:r>
           </w:p>
         </w:tc>
@@ -6407,18 +4894,6 @@
               </w:rPr>
               <w:t xml:space="preserve">Final</w:t>
             </w:r>
-            <w:r>
-              <w:rPr>
-                <w:sz w:val="20"/>
-                <w:szCs w:val="20"/>
-              </w:rPr>
-            </w:r>
-            <w:r>
-              <w:rPr>
-                <w:sz w:val="20"/>
-                <w:szCs w:val="20"/>
-              </w:rPr>
-            </w:r>
           </w:p>
         </w:tc>
         <w:tc>
@@ -6451,34 +4926,9 @@
               <w:rPr>
                 <w:sz w:val="20"/>
                 <w:szCs w:val="20"/>
-              </w:rPr>
-            </w:r>
-            <w:r>
-              <w:rPr>
-                <w:sz w:val="20"/>
-                <w:szCs w:val="20"/>
                 <w:lang w:val="es-ES"/>
               </w:rPr>
-              <w:t xml:space="preserve">Cierre de proyecto</w:t>
-            </w:r>
-            <w:r>
-              <w:rPr>
-                <w:sz w:val="20"/>
-                <w:szCs w:val="20"/>
-              </w:rPr>
-              <w:t xml:space="preserve"> y Manuales de Operación</w:t>
-            </w:r>
-            <w:r>
-              <w:rPr>
-                <w:sz w:val="20"/>
-                <w:szCs w:val="20"/>
-              </w:rPr>
-            </w:r>
-            <w:r>
-              <w:rPr>
-                <w:sz w:val="20"/>
-                <w:szCs w:val="20"/>
-              </w:rPr>
+              <w:t xml:space="preserve">Manuales y Memoria de Proyecto</w:t>
             </w:r>
           </w:p>
         </w:tc>
@@ -6513,25 +4963,7 @@
                 <w:sz w:val="20"/>
                 <w:szCs w:val="20"/>
               </w:rPr>
-            </w:r>
-            <w:r>
-              <w:rPr>
-                <w:sz w:val="20"/>
-                <w:szCs w:val="20"/>
-              </w:rPr>
-              <w:t xml:space="preserve">Documento formal consolidado del proyecto APT acompañado de los manuales de usuario y administración del sistema.</w:t>
-            </w:r>
-            <w:r>
-              <w:rPr>
-                <w:sz w:val="20"/>
-                <w:szCs w:val="20"/>
-              </w:rPr>
-            </w:r>
-            <w:r>
-              <w:rPr>
-                <w:sz w:val="20"/>
-                <w:szCs w:val="20"/>
-              </w:rPr>
+              <w:t xml:space="preserve">Manuales para usuario y administrador y consolidación formal del informe de titulación.</w:t>
             </w:r>
           </w:p>
         </w:tc>
@@ -6566,25 +4998,7 @@
                 <w:sz w:val="20"/>
                 <w:szCs w:val="20"/>
               </w:rPr>
-            </w:r>
-            <w:r>
-              <w:rPr>
-                <w:sz w:val="20"/>
-                <w:szCs w:val="20"/>
-              </w:rPr>
-              <w:t xml:space="preserve">Formaliza el cierre curricular de la solución desarrollada y facilita la transferencia tecnológica al cliente.</w:t>
-            </w:r>
-            <w:r>
-              <w:rPr>
-                <w:sz w:val="20"/>
-                <w:szCs w:val="20"/>
-              </w:rPr>
-            </w:r>
-            <w:r>
-              <w:rPr>
-                <w:sz w:val="20"/>
-                <w:szCs w:val="20"/>
-              </w:rPr>
+              <w:t xml:space="preserve">Formaliza el cierre curricular y facilita la transferencia del sistema.</w:t>
             </w:r>
           </w:p>
         </w:tc>
@@ -7290,25 +5704,7 @@
                 <w:sz w:val="20"/>
                 <w:szCs w:val="20"/>
               </w:rPr>
-            </w:r>
-            <w:r>
-              <w:rPr>
-                <w:sz w:val="20"/>
-                <w:szCs w:val="20"/>
-              </w:rPr>
-              <w:t xml:space="preserve">Gestión y Modelamiento de Datos</w:t>
-            </w:r>
-            <w:r>
-              <w:rPr>
-                <w:sz w:val="20"/>
-                <w:szCs w:val="20"/>
-              </w:rPr>
-            </w:r>
-            <w:r>
-              <w:rPr>
-                <w:sz w:val="20"/>
-                <w:szCs w:val="20"/>
-              </w:rPr>
+              <w:t xml:space="preserve">Análisis y Requisitos</w:t>
             </w:r>
           </w:p>
         </w:tc>
@@ -7335,25 +5731,7 @@
                 <w:sz w:val="20"/>
                 <w:szCs w:val="20"/>
               </w:rPr>
-            </w:r>
-            <w:r>
-              <w:rPr>
-                <w:sz w:val="20"/>
-                <w:szCs w:val="20"/>
-              </w:rPr>
-              <w:t xml:space="preserve">Sprint 0: Alcance y Modelado de Datos</w:t>
-            </w:r>
-            <w:r>
-              <w:rPr>
-                <w:sz w:val="20"/>
-                <w:szCs w:val="20"/>
-              </w:rPr>
-            </w:r>
-            <w:r>
-              <w:rPr>
-                <w:sz w:val="20"/>
-                <w:szCs w:val="20"/>
-              </w:rPr>
+              <w:t xml:space="preserve">Fase 1: Análisis y Requisitos</w:t>
             </w:r>
           </w:p>
         </w:tc>
@@ -7380,25 +5758,7 @@
                 <w:sz w:val="20"/>
                 <w:szCs w:val="20"/>
               </w:rPr>
-            </w:r>
-            <w:r>
-              <w:rPr>
-                <w:sz w:val="20"/>
-                <w:szCs w:val="20"/>
-              </w:rPr>
-              <w:t xml:space="preserve">Diseño conceptual, lógico y físico de tablas relacionales (esquemas local y cloud), definición de índices y tablas de sincronización.</w:t>
-            </w:r>
-            <w:r>
-              <w:rPr>
-                <w:sz w:val="20"/>
-                <w:szCs w:val="20"/>
-              </w:rPr>
-            </w:r>
-            <w:r>
-              <w:rPr>
-                <w:sz w:val="20"/>
-                <w:szCs w:val="20"/>
-              </w:rPr>
+              <w:t xml:space="preserve">Levantamiento del problema, actores y roles, y especificación de los 18 módulos funcionales con sus reglas de negocio y decisiones de alcance. Hito: especificación congelada.</w:t>
             </w:r>
           </w:p>
         </w:tc>
@@ -7425,40 +5785,7 @@
                 <w:sz w:val="20"/>
                 <w:szCs w:val="20"/>
               </w:rPr>
-            </w:r>
-            <w:r>
-              <w:rPr>
-                <w:sz w:val="20"/>
-                <w:szCs w:val="20"/>
-              </w:rPr>
-              <w:t xml:space="preserve">Software</w:t>
-            </w:r>
-            <w:r>
-              <w:rPr>
-                <w:sz w:val="20"/>
-                <w:szCs w:val="20"/>
-                <w:lang w:val="es-ES"/>
-              </w:rPr>
-              <w:t xml:space="preserve"> de </w:t>
-            </w:r>
-            <w:r>
-              <w:rPr>
-                <w:sz w:val="20"/>
-                <w:szCs w:val="20"/>
-              </w:rPr>
-              <w:t xml:space="preserve">Modelado, computadores, documentación de PostgreSQL/SQLite.</w:t>
-            </w:r>
-            <w:r>
-              <w:rPr>
-                <w:sz w:val="20"/>
-                <w:szCs w:val="20"/>
-              </w:rPr>
-            </w:r>
-            <w:r>
-              <w:rPr>
-                <w:sz w:val="20"/>
-                <w:szCs w:val="20"/>
-              </w:rPr>
+              <w:t xml:space="preserve">Documentación, repositorio y herramientas de diseño.</w:t>
             </w:r>
           </w:p>
         </w:tc>
@@ -7486,25 +5813,7 @@
                 <w:sz w:val="20"/>
                 <w:szCs w:val="20"/>
               </w:rPr>
-            </w:r>
-            <w:r>
-              <w:rPr>
-                <w:sz w:val="20"/>
-                <w:szCs w:val="20"/>
-              </w:rPr>
-              <w:t xml:space="preserve">Semanas 1 - 2 </w:t>
-            </w:r>
-            <w:r>
-              <w:rPr>
-                <w:sz w:val="20"/>
-                <w:szCs w:val="20"/>
-              </w:rPr>
-            </w:r>
-            <w:r>
-              <w:rPr>
-                <w:sz w:val="20"/>
-                <w:szCs w:val="20"/>
-              </w:rPr>
+              <w:t xml:space="preserve">Semanas 1 - 2</w:t>
             </w:r>
           </w:p>
         </w:tc>
@@ -7533,25 +5842,7 @@
                 <w:sz w:val="20"/>
                 <w:szCs w:val="20"/>
               </w:rPr>
-            </w:r>
-            <w:r>
-              <w:rPr>
-                <w:sz w:val="20"/>
-                <w:szCs w:val="20"/>
-              </w:rPr>
-              <w:t xml:space="preserve">Joaquin Cabrera</w:t>
-            </w:r>
-            <w:r>
-              <w:rPr>
-                <w:sz w:val="20"/>
-                <w:szCs w:val="20"/>
-              </w:rPr>
-            </w:r>
-            <w:r>
-              <w:rPr>
-                <w:sz w:val="20"/>
-                <w:szCs w:val="20"/>
-              </w:rPr>
+              <w:t xml:space="preserve">Joaquín Cabrera</w:t>
             </w:r>
           </w:p>
         </w:tc>
@@ -7578,25 +5869,7 @@
                 <w:sz w:val="20"/>
                 <w:szCs w:val="20"/>
               </w:rPr>
-            </w:r>
-            <w:r>
-              <w:rPr>
-                <w:sz w:val="20"/>
-                <w:szCs w:val="20"/>
-              </w:rPr>
-              <w:t xml:space="preserve">Facilitador: Requerimientos claros recopilados de clientes. Dificultad: Conciliar esquemas heterogéneos local-cloud.</w:t>
-            </w:r>
-            <w:r>
-              <w:rPr>
-                <w:sz w:val="20"/>
-                <w:szCs w:val="20"/>
-              </w:rPr>
-            </w:r>
-            <w:r>
-              <w:rPr>
-                <w:sz w:val="20"/>
-                <w:szCs w:val="20"/>
-              </w:rPr>
+              <w:t xml:space="preserve">Facilitador: Problema claramente identificado. Dificultad: Acotar el alcance de los 18 módulos.</w:t>
             </w:r>
           </w:p>
         </w:tc>
@@ -7637,25 +5910,7 @@
                 <w:sz w:val="20"/>
                 <w:szCs w:val="20"/>
               </w:rPr>
-            </w:r>
-            <w:r>
-              <w:rPr>
-                <w:sz w:val="20"/>
-                <w:szCs w:val="20"/>
-              </w:rPr>
-              <w:t xml:space="preserve">Desarrollo de Software y Seguridad</w:t>
-            </w:r>
-            <w:r>
-              <w:rPr>
-                <w:sz w:val="20"/>
-                <w:szCs w:val="20"/>
-              </w:rPr>
-            </w:r>
-            <w:r>
-              <w:rPr>
-                <w:sz w:val="20"/>
-                <w:szCs w:val="20"/>
-              </w:rPr>
+              <w:t xml:space="preserve">Modelamiento de Datos y Arquitectura</w:t>
             </w:r>
           </w:p>
         </w:tc>
@@ -7691,25 +5946,7 @@
                 <w:sz w:val="20"/>
                 <w:szCs w:val="20"/>
               </w:rPr>
-            </w:r>
-            <w:r>
-              <w:rPr>
-                <w:sz w:val="20"/>
-                <w:szCs w:val="20"/>
-              </w:rPr>
-              <w:t xml:space="preserve">Sprint 1: Gestión Comercial, Catálogo e Inventario Base</w:t>
-            </w:r>
-            <w:r>
-              <w:rPr>
-                <w:sz w:val="20"/>
-                <w:szCs w:val="20"/>
-              </w:rPr>
-            </w:r>
-            <w:r>
-              <w:rPr>
-                <w:sz w:val="20"/>
-                <w:szCs w:val="20"/>
-              </w:rPr>
+              <w:t xml:space="preserve">Fase 2: Diseño</w:t>
             </w:r>
           </w:p>
         </w:tc>
@@ -7745,25 +5982,7 @@
                 <w:sz w:val="20"/>
                 <w:szCs w:val="20"/>
               </w:rPr>
-            </w:r>
-            <w:r>
-              <w:rPr>
-                <w:sz w:val="20"/>
-                <w:szCs w:val="20"/>
-              </w:rPr>
-              <w:t xml:space="preserve">Implementación de autenticación por PIN, roles, sesiones de caja, catálogo de productos y módulo de inventario base (registro de existencias, compras a proveedores, ajustes de merma y descuento automático de stock por venta).</w:t>
-            </w:r>
-            <w:r>
-              <w:rPr>
-                <w:sz w:val="20"/>
-                <w:szCs w:val="20"/>
-              </w:rPr>
-            </w:r>
-            <w:r>
-              <w:rPr>
-                <w:sz w:val="20"/>
-                <w:szCs w:val="20"/>
-              </w:rPr>
+              <w:t xml:space="preserve">Modelo de datos relacional (23 tablas), arquitectura de las tres aplicaciones y del paquete compartido, diseño de seguridad y autenticación, y plan de implementación.</w:t>
             </w:r>
           </w:p>
         </w:tc>
@@ -7799,25 +6018,7 @@
                 <w:sz w:val="20"/>
                 <w:szCs w:val="20"/>
               </w:rPr>
-            </w:r>
-            <w:r>
-              <w:rPr>
-                <w:sz w:val="20"/>
-                <w:szCs w:val="20"/>
-              </w:rPr>
-              <w:t xml:space="preserve">Entorno IDE, Node.js/TypeScript, motor local de persistencia.</w:t>
-            </w:r>
-            <w:r>
-              <w:rPr>
-                <w:sz w:val="20"/>
-                <w:szCs w:val="20"/>
-              </w:rPr>
-            </w:r>
-            <w:r>
-              <w:rPr>
-                <w:sz w:val="20"/>
-                <w:szCs w:val="20"/>
-              </w:rPr>
+              <w:t xml:space="preserve">PostgreSQL 16, documentación técnica.</w:t>
             </w:r>
           </w:p>
         </w:tc>
@@ -7853,40 +6054,7 @@
                 <w:sz w:val="20"/>
                 <w:szCs w:val="20"/>
               </w:rPr>
-            </w:r>
-            <w:r>
-              <w:rPr>
-                <w:sz w:val="20"/>
-                <w:szCs w:val="20"/>
-              </w:rPr>
-              <w:t xml:space="preserve">Semanas</w:t>
-            </w:r>
-            <w:r>
-              <w:rPr>
-                <w:sz w:val="20"/>
-                <w:szCs w:val="20"/>
-                <w:lang w:val="es-ES"/>
-              </w:rPr>
-              <w:t xml:space="preserve"> </w:t>
-            </w:r>
-            <w:r>
-              <w:rPr>
-                <w:sz w:val="20"/>
-                <w:szCs w:val="20"/>
-              </w:rPr>
-              <w:t xml:space="preserve"> 3 - 4 </w:t>
-            </w:r>
-            <w:r>
-              <w:rPr>
-                <w:sz w:val="20"/>
-                <w:szCs w:val="20"/>
-              </w:rPr>
-            </w:r>
-            <w:r>
-              <w:rPr>
-                <w:sz w:val="20"/>
-                <w:szCs w:val="20"/>
-              </w:rPr>
+              <w:t xml:space="preserve">Semanas 3 - 4</w:t>
             </w:r>
           </w:p>
         </w:tc>
@@ -7922,25 +6090,7 @@
                 <w:sz w:val="20"/>
                 <w:szCs w:val="20"/>
               </w:rPr>
-            </w:r>
-            <w:r>
-              <w:rPr>
-                <w:sz w:val="20"/>
-                <w:szCs w:val="20"/>
-              </w:rPr>
-              <w:t xml:space="preserve">Sebastián Quilodran</w:t>
-            </w:r>
-            <w:r>
-              <w:rPr>
-                <w:sz w:val="20"/>
-                <w:szCs w:val="20"/>
-              </w:rPr>
-            </w:r>
-            <w:r>
-              <w:rPr>
-                <w:sz w:val="20"/>
-                <w:szCs w:val="20"/>
-              </w:rPr>
+              <w:t xml:space="preserve">Joaquín Cabrera</w:t>
             </w:r>
           </w:p>
         </w:tc>
@@ -7976,33 +6126,7 @@
                 <w:sz w:val="20"/>
                 <w:szCs w:val="20"/>
               </w:rPr>
-            </w:r>
-            <w:r>
-              <w:rPr>
-                <w:sz w:val="20"/>
-                <w:szCs w:val="20"/>
-              </w:rPr>
-              <w:t xml:space="preserve">Facilitador: Lógica CRUD estandarizada. Dificultad: Modelar reglas flexibles para cuentas de crédito</w:t>
-            </w:r>
-            <w:r>
-              <w:rPr>
-                <w:sz w:val="20"/>
-                <w:szCs w:val="20"/>
-                <w:lang w:val="es-ES"/>
-              </w:rPr>
-              <w:t xml:space="preserve">.</w:t>
-            </w:r>
-            <w:r>
-              <w:rPr>
-                <w:sz w:val="20"/>
-                <w:szCs w:val="20"/>
-              </w:rPr>
-            </w:r>
-            <w:r>
-              <w:rPr>
-                <w:sz w:val="20"/>
-                <w:szCs w:val="20"/>
-              </w:rPr>
+              <w:t xml:space="preserve">Facilitador: Requisitos ya congelados. Dificultad: Diseñar el aislamiento multi-empresa y las referencias circulares del esquema.</w:t>
             </w:r>
           </w:p>
         </w:tc>
@@ -8043,25 +6167,7 @@
                 <w:sz w:val="20"/>
                 <w:szCs w:val="20"/>
               </w:rPr>
-            </w:r>
-            <w:r>
-              <w:rPr>
-                <w:sz w:val="20"/>
-                <w:szCs w:val="20"/>
-              </w:rPr>
-              <w:t xml:space="preserve">Desarrollo de Software e Integración</w:t>
-            </w:r>
-            <w:r>
-              <w:rPr>
-                <w:sz w:val="20"/>
-                <w:szCs w:val="20"/>
-              </w:rPr>
-            </w:r>
-            <w:r>
-              <w:rPr>
-                <w:sz w:val="20"/>
-                <w:szCs w:val="20"/>
-              </w:rPr>
+              <w:t xml:space="preserve">Desarrollo de Software y Seguridad</w:t>
             </w:r>
           </w:p>
         </w:tc>
@@ -8097,25 +6203,7 @@
                 <w:sz w:val="20"/>
                 <w:szCs w:val="20"/>
               </w:rPr>
-            </w:r>
-            <w:r>
-              <w:rPr>
-                <w:sz w:val="20"/>
-                <w:szCs w:val="20"/>
-              </w:rPr>
-              <w:t xml:space="preserve">Sprint 2: Terminal Transaccional de Ventas (MVP)</w:t>
-            </w:r>
-            <w:r>
-              <w:rPr>
-                <w:sz w:val="20"/>
-                <w:szCs w:val="20"/>
-              </w:rPr>
-            </w:r>
-            <w:r>
-              <w:rPr>
-                <w:sz w:val="20"/>
-                <w:szCs w:val="20"/>
-              </w:rPr>
+              <w:t xml:space="preserve">Fase 3.1: Implementación de la API</w:t>
             </w:r>
           </w:p>
         </w:tc>
@@ -8151,25 +6239,7 @@
                 <w:sz w:val="20"/>
                 <w:szCs w:val="20"/>
               </w:rPr>
-            </w:r>
-            <w:r>
-              <w:rPr>
-                <w:sz w:val="20"/>
-                <w:szCs w:val="20"/>
-              </w:rPr>
-              <w:t xml:space="preserve">Interfaz de venta rápida con atajos de teclado, búsqueda predictiva, múltiples tickets en simultáneo, cobro multicanal, integración con lector óptico y actualización transaccional del stock en tiempo real.</w:t>
-            </w:r>
-            <w:r>
-              <w:rPr>
-                <w:sz w:val="20"/>
-                <w:szCs w:val="20"/>
-              </w:rPr>
-            </w:r>
-            <w:r>
-              <w:rPr>
-                <w:sz w:val="20"/>
-                <w:szCs w:val="20"/>
-              </w:rPr>
+              <w:t xml:space="preserve">API en NestJS: autenticación y sesiones, multi-empresa y alcance por sucursal, módulos de negocio, transacciones, folios correlativos, PDFs, correos con outbox y tareas programadas.</w:t>
             </w:r>
           </w:p>
         </w:tc>
@@ -8205,25 +6275,7 @@
                 <w:sz w:val="20"/>
                 <w:szCs w:val="20"/>
               </w:rPr>
-            </w:r>
-            <w:r>
-              <w:rPr>
-                <w:sz w:val="20"/>
-                <w:szCs w:val="20"/>
-              </w:rPr>
-              <w:t xml:space="preserve">Lector de código de barras, impresora térmica, entorno de pruebas.</w:t>
-            </w:r>
-            <w:r>
-              <w:rPr>
-                <w:sz w:val="20"/>
-                <w:szCs w:val="20"/>
-              </w:rPr>
-            </w:r>
-            <w:r>
-              <w:rPr>
-                <w:sz w:val="20"/>
-                <w:szCs w:val="20"/>
-              </w:rPr>
+              <w:t xml:space="preserve">Node.js/TypeScript, NestJS, PostgreSQL, Jest.</w:t>
             </w:r>
           </w:p>
         </w:tc>
@@ -8259,40 +6311,7 @@
                 <w:sz w:val="20"/>
                 <w:szCs w:val="20"/>
               </w:rPr>
-            </w:r>
-            <w:r>
-              <w:rPr>
-                <w:sz w:val="20"/>
-                <w:szCs w:val="20"/>
-              </w:rPr>
-              <w:t xml:space="preserve">Semanas </w:t>
-            </w:r>
-            <w:r>
-              <w:rPr>
-                <w:sz w:val="20"/>
-                <w:szCs w:val="20"/>
-                <w:lang w:val="es-ES"/>
-              </w:rPr>
-              <w:t xml:space="preserve"> </w:t>
-            </w:r>
-            <w:r>
-              <w:rPr>
-                <w:sz w:val="20"/>
-                <w:szCs w:val="20"/>
-              </w:rPr>
-              <w:t xml:space="preserve">5 - 6 </w:t>
-            </w:r>
-            <w:r>
-              <w:rPr>
-                <w:sz w:val="20"/>
-                <w:szCs w:val="20"/>
-              </w:rPr>
-            </w:r>
-            <w:r>
-              <w:rPr>
-                <w:sz w:val="20"/>
-                <w:szCs w:val="20"/>
-              </w:rPr>
+              <w:t xml:space="preserve">Semanas 5 - 6</w:t>
             </w:r>
           </w:p>
         </w:tc>
@@ -8328,25 +6347,7 @@
                 <w:sz w:val="20"/>
                 <w:szCs w:val="20"/>
               </w:rPr>
-            </w:r>
-            <w:r>
-              <w:rPr>
-                <w:sz w:val="20"/>
-                <w:szCs w:val="20"/>
-              </w:rPr>
-              <w:t xml:space="preserve">Joaquin Cabrera / Sebastián Quilodran</w:t>
-            </w:r>
-            <w:r>
-              <w:rPr>
-                <w:sz w:val="20"/>
-                <w:szCs w:val="20"/>
-              </w:rPr>
-            </w:r>
-            <w:r>
-              <w:rPr>
-                <w:sz w:val="20"/>
-                <w:szCs w:val="20"/>
-              </w:rPr>
+              <w:t xml:space="preserve">Joaquín Cabrera</w:t>
             </w:r>
           </w:p>
         </w:tc>
@@ -8382,25 +6383,7 @@
                 <w:sz w:val="20"/>
                 <w:szCs w:val="20"/>
               </w:rPr>
-            </w:r>
-            <w:r>
-              <w:rPr>
-                <w:sz w:val="20"/>
-                <w:szCs w:val="20"/>
-              </w:rPr>
-              <w:t xml:space="preserve">Facilitador: Disponibilidad de periféricos físicos para pruebas. Dificultad: Comunicación a bajo nivel con controladores de impresión.</w:t>
-            </w:r>
-            <w:r>
-              <w:rPr>
-                <w:sz w:val="20"/>
-                <w:szCs w:val="20"/>
-              </w:rPr>
-            </w:r>
-            <w:r>
-              <w:rPr>
-                <w:sz w:val="20"/>
-                <w:szCs w:val="20"/>
-              </w:rPr>
+              <w:t xml:space="preserve">Facilitador: Arquitectura en capas definida en el diseño. Dificultad: Garantizar integridad y concurrencia en operaciones multi-tabla.</w:t>
             </w:r>
           </w:p>
         </w:tc>
@@ -8441,25 +6424,7 @@
                 <w:sz w:val="20"/>
                 <w:szCs w:val="20"/>
               </w:rPr>
-            </w:r>
-            <w:r>
-              <w:rPr>
-                <w:sz w:val="20"/>
-                <w:szCs w:val="20"/>
-              </w:rPr>
-              <w:t xml:space="preserve">Big Data y Análisis de Datos</w:t>
-            </w:r>
-            <w:r>
-              <w:rPr>
-                <w:sz w:val="20"/>
-                <w:szCs w:val="20"/>
-              </w:rPr>
-            </w:r>
-            <w:r>
-              <w:rPr>
-                <w:sz w:val="20"/>
-                <w:szCs w:val="20"/>
-              </w:rPr>
+              <w:t xml:space="preserve">Desarrollo de Software y Experiencia de Usuario</w:t>
             </w:r>
           </w:p>
         </w:tc>
@@ -8495,25 +6460,7 @@
                 <w:sz w:val="20"/>
                 <w:szCs w:val="20"/>
               </w:rPr>
-            </w:r>
-            <w:r>
-              <w:rPr>
-                <w:sz w:val="20"/>
-                <w:szCs w:val="20"/>
-              </w:rPr>
-              <w:t xml:space="preserve">Sprint 3: Motor de Análisis y Patrones de Venta</w:t>
-            </w:r>
-            <w:r>
-              <w:rPr>
-                <w:sz w:val="20"/>
-                <w:szCs w:val="20"/>
-              </w:rPr>
-            </w:r>
-            <w:r>
-              <w:rPr>
-                <w:sz w:val="20"/>
-                <w:szCs w:val="20"/>
-              </w:rPr>
+              <w:t xml:space="preserve">Fase 3.2: Implementación del Panel de Gestión</w:t>
             </w:r>
           </w:p>
         </w:tc>
@@ -8549,25 +6496,7 @@
                 <w:sz w:val="20"/>
                 <w:szCs w:val="20"/>
               </w:rPr>
-            </w:r>
-            <w:r>
-              <w:rPr>
-                <w:sz w:val="20"/>
-                <w:szCs w:val="20"/>
-              </w:rPr>
-              <w:t xml:space="preserve">Programación de tareas en segundo plano para cálculo de rentabilidad neta por departamento, tendencias temporales y reglas de compra cruzada.</w:t>
-            </w:r>
-            <w:r>
-              <w:rPr>
-                <w:sz w:val="20"/>
-                <w:szCs w:val="20"/>
-              </w:rPr>
-            </w:r>
-            <w:r>
-              <w:rPr>
-                <w:sz w:val="20"/>
-                <w:szCs w:val="20"/>
-              </w:rPr>
+              <w:t xml:space="preserve">Panel en React: inventario con fotos, clientes, documentos comerciales, ventas, gastos, consignaciones, notificaciones, auditoría y configuración, con diseño adaptable.</w:t>
             </w:r>
           </w:p>
         </w:tc>
@@ -8603,25 +6532,7 @@
                 <w:sz w:val="20"/>
                 <w:szCs w:val="20"/>
               </w:rPr>
-            </w:r>
-            <w:r>
-              <w:rPr>
-                <w:sz w:val="20"/>
-                <w:szCs w:val="20"/>
-              </w:rPr>
-              <w:t xml:space="preserve">Módulos matemáticos y analíticos, bases de datos de prueba.</w:t>
-            </w:r>
-            <w:r>
-              <w:rPr>
-                <w:sz w:val="20"/>
-                <w:szCs w:val="20"/>
-              </w:rPr>
-            </w:r>
-            <w:r>
-              <w:rPr>
-                <w:sz w:val="20"/>
-                <w:szCs w:val="20"/>
-              </w:rPr>
+              <w:t xml:space="preserve">React 19, Vite, TanStack Query, Tailwind CSS.</w:t>
             </w:r>
           </w:p>
         </w:tc>
@@ -8657,25 +6568,7 @@
                 <w:sz w:val="20"/>
                 <w:szCs w:val="20"/>
               </w:rPr>
-            </w:r>
-            <w:r>
-              <w:rPr>
-                <w:sz w:val="20"/>
-                <w:szCs w:val="20"/>
-              </w:rPr>
-              <w:t xml:space="preserve">Semanas 7 - 8 (Octubre)</w:t>
-            </w:r>
-            <w:r>
-              <w:rPr>
-                <w:sz w:val="20"/>
-                <w:szCs w:val="20"/>
-              </w:rPr>
-            </w:r>
-            <w:r>
-              <w:rPr>
-                <w:sz w:val="20"/>
-                <w:szCs w:val="20"/>
-              </w:rPr>
+              <w:t xml:space="preserve">Semana 7</w:t>
             </w:r>
           </w:p>
         </w:tc>
@@ -8711,25 +6604,7 @@
                 <w:sz w:val="20"/>
                 <w:szCs w:val="20"/>
               </w:rPr>
-            </w:r>
-            <w:r>
-              <w:rPr>
-                <w:sz w:val="20"/>
-                <w:szCs w:val="20"/>
-              </w:rPr>
-              <w:t xml:space="preserve">Joaquin Cabrera</w:t>
-            </w:r>
-            <w:r>
-              <w:rPr>
-                <w:sz w:val="20"/>
-                <w:szCs w:val="20"/>
-              </w:rPr>
-            </w:r>
-            <w:r>
-              <w:rPr>
-                <w:sz w:val="20"/>
-                <w:szCs w:val="20"/>
-              </w:rPr>
+              <w:t xml:space="preserve">Joaquín Cabrera</w:t>
             </w:r>
           </w:p>
         </w:tc>
@@ -8765,25 +6640,7 @@
                 <w:sz w:val="20"/>
                 <w:szCs w:val="20"/>
               </w:rPr>
-            </w:r>
-            <w:r>
-              <w:rPr>
-                <w:sz w:val="20"/>
-                <w:szCs w:val="20"/>
-              </w:rPr>
-              <w:t xml:space="preserve">Facilitador: Algoritmos deterministas claros. Dificultad: Evitar que el consumo de memoria y CPU entorpezca la pantalla de cobro.</w:t>
-            </w:r>
-            <w:r>
-              <w:rPr>
-                <w:sz w:val="20"/>
-                <w:szCs w:val="20"/>
-              </w:rPr>
-            </w:r>
-            <w:r>
-              <w:rPr>
-                <w:sz w:val="20"/>
-                <w:szCs w:val="20"/>
-              </w:rPr>
+              <w:t xml:space="preserve">Facilitador: API ya disponible. Dificultad: Cubrir 18 módulos con interfaz consistente y adaptable a celular.</w:t>
             </w:r>
           </w:p>
         </w:tc>
@@ -8824,25 +6681,7 @@
                 <w:sz w:val="20"/>
                 <w:szCs w:val="20"/>
               </w:rPr>
-            </w:r>
-            <w:r>
-              <w:rPr>
-                <w:sz w:val="20"/>
-                <w:szCs w:val="20"/>
-              </w:rPr>
-              <w:t xml:space="preserve">Desarrollo de Software y Analítica</w:t>
-            </w:r>
-            <w:r>
-              <w:rPr>
-                <w:sz w:val="20"/>
-                <w:szCs w:val="20"/>
-              </w:rPr>
-            </w:r>
-            <w:r>
-              <w:rPr>
-                <w:sz w:val="20"/>
-                <w:szCs w:val="20"/>
-              </w:rPr>
+              <w:t xml:space="preserve">Análisis de Datos y Desarrollo Web</w:t>
             </w:r>
           </w:p>
         </w:tc>
@@ -8878,25 +6717,7 @@
                 <w:sz w:val="20"/>
                 <w:szCs w:val="20"/>
               </w:rPr>
-            </w:r>
-            <w:r>
-              <w:rPr>
-                <w:sz w:val="20"/>
-                <w:szCs w:val="20"/>
-              </w:rPr>
-              <w:t xml:space="preserve">Sprint 4: Generador de Diagnósticos e Insights</w:t>
-            </w:r>
-            <w:r>
-              <w:rPr>
-                <w:sz w:val="20"/>
-                <w:szCs w:val="20"/>
-              </w:rPr>
-            </w:r>
-            <w:r>
-              <w:rPr>
-                <w:sz w:val="20"/>
-                <w:szCs w:val="20"/>
-              </w:rPr>
+              <w:t xml:space="preserve">Fase 3.3: Dashboard, Analítica y Sitio Público</w:t>
             </w:r>
           </w:p>
         </w:tc>
@@ -8932,25 +6753,7 @@
                 <w:sz w:val="20"/>
                 <w:szCs w:val="20"/>
               </w:rPr>
-            </w:r>
-            <w:r>
-              <w:rPr>
-                <w:sz w:val="20"/>
-                <w:szCs w:val="20"/>
-              </w:rPr>
-              <w:t xml:space="preserve">Lógica para traducir métricas en recomendaciones directas: sugerencias de combos comerciales, alertas preventivas de quiebre y clasificación de rotación.</w:t>
-            </w:r>
-            <w:r>
-              <w:rPr>
-                <w:sz w:val="20"/>
-                <w:szCs w:val="20"/>
-              </w:rPr>
-            </w:r>
-            <w:r>
-              <w:rPr>
-                <w:sz w:val="20"/>
-                <w:szCs w:val="20"/>
-              </w:rPr>
+              <w:t xml:space="preserve">Dashboard e indicadores de analítica, y sitio público en Next.js con marketplace, vitrinas por subdominio y SEO.</w:t>
             </w:r>
           </w:p>
         </w:tc>
@@ -8986,25 +6789,7 @@
                 <w:sz w:val="20"/>
                 <w:szCs w:val="20"/>
               </w:rPr>
-            </w:r>
-            <w:r>
-              <w:rPr>
-                <w:sz w:val="20"/>
-                <w:szCs w:val="20"/>
-              </w:rPr>
-              <w:t xml:space="preserve">IDE, librerías de componentes visuales, datasets de validación.</w:t>
-            </w:r>
-            <w:r>
-              <w:rPr>
-                <w:sz w:val="20"/>
-                <w:szCs w:val="20"/>
-              </w:rPr>
-            </w:r>
-            <w:r>
-              <w:rPr>
-                <w:sz w:val="20"/>
-                <w:szCs w:val="20"/>
-              </w:rPr>
+              <w:t xml:space="preserve">Next.js 15, middleware de subdominios, datos de demostración.</w:t>
             </w:r>
           </w:p>
         </w:tc>
@@ -9040,40 +6825,7 @@
                 <w:sz w:val="20"/>
                 <w:szCs w:val="20"/>
               </w:rPr>
-            </w:r>
-            <w:r>
-              <w:rPr>
-                <w:sz w:val="20"/>
-                <w:szCs w:val="20"/>
-              </w:rPr>
-              <w:t xml:space="preserve">Semanas </w:t>
-            </w:r>
-            <w:r>
-              <w:rPr>
-                <w:sz w:val="20"/>
-                <w:szCs w:val="20"/>
-                <w:lang w:val="es-ES"/>
-              </w:rPr>
-              <w:t xml:space="preserve"> </w:t>
-            </w:r>
-            <w:r>
-              <w:rPr>
-                <w:sz w:val="20"/>
-                <w:szCs w:val="20"/>
-              </w:rPr>
-              <w:t xml:space="preserve">9 - 10 </w:t>
-            </w:r>
-            <w:r>
-              <w:rPr>
-                <w:sz w:val="20"/>
-                <w:szCs w:val="20"/>
-              </w:rPr>
-            </w:r>
-            <w:r>
-              <w:rPr>
-                <w:sz w:val="20"/>
-                <w:szCs w:val="20"/>
-              </w:rPr>
+              <w:t xml:space="preserve">Semana 8</w:t>
             </w:r>
           </w:p>
         </w:tc>
@@ -9109,25 +6861,7 @@
                 <w:sz w:val="20"/>
                 <w:szCs w:val="20"/>
               </w:rPr>
-            </w:r>
-            <w:r>
-              <w:rPr>
-                <w:sz w:val="20"/>
-                <w:szCs w:val="20"/>
-              </w:rPr>
-              <w:t xml:space="preserve">Brayan Cid / Joaquin Cabrera</w:t>
-            </w:r>
-            <w:r>
-              <w:rPr>
-                <w:sz w:val="20"/>
-                <w:szCs w:val="20"/>
-              </w:rPr>
-            </w:r>
-            <w:r>
-              <w:rPr>
-                <w:sz w:val="20"/>
-                <w:szCs w:val="20"/>
-              </w:rPr>
+              <w:t xml:space="preserve">Joaquín Cabrera</w:t>
             </w:r>
           </w:p>
         </w:tc>
@@ -9163,25 +6897,7 @@
                 <w:sz w:val="20"/>
                 <w:szCs w:val="20"/>
               </w:rPr>
-            </w:r>
-            <w:r>
-              <w:rPr>
-                <w:sz w:val="20"/>
-                <w:szCs w:val="20"/>
-              </w:rPr>
-              <w:t xml:space="preserve">Facilitador: Algoritmos deterministas claros. Dificultad: Evitar que el consumo de memoria y CPU entorpezca la pantalla de cobro.</w:t>
-            </w:r>
-            <w:r>
-              <w:rPr>
-                <w:sz w:val="20"/>
-                <w:szCs w:val="20"/>
-              </w:rPr>
-            </w:r>
-            <w:r>
-              <w:rPr>
-                <w:sz w:val="20"/>
-                <w:szCs w:val="20"/>
-              </w:rPr>
+              <w:t xml:space="preserve">Facilitador: Datos de demostración generados con los servicios reales. Dificultad: Resolver subdominios y SEO por automotora.</w:t>
             </w:r>
           </w:p>
         </w:tc>
@@ -9222,25 +6938,7 @@
                 <w:sz w:val="20"/>
                 <w:szCs w:val="20"/>
               </w:rPr>
-            </w:r>
-            <w:r>
-              <w:rPr>
-                <w:sz w:val="20"/>
-                <w:szCs w:val="20"/>
-              </w:rPr>
-              <w:t xml:space="preserve">Sistemas Distribuidos y Seguridad</w:t>
-            </w:r>
-            <w:r>
-              <w:rPr>
-                <w:sz w:val="20"/>
-                <w:szCs w:val="20"/>
-              </w:rPr>
-            </w:r>
-            <w:r>
-              <w:rPr>
-                <w:sz w:val="20"/>
-                <w:szCs w:val="20"/>
-              </w:rPr>
+              <w:t xml:space="preserve">Pruebas, Calidad y Seguridad</w:t>
             </w:r>
           </w:p>
         </w:tc>
@@ -9276,25 +6974,7 @@
                 <w:sz w:val="20"/>
                 <w:szCs w:val="20"/>
               </w:rPr>
-            </w:r>
-            <w:r>
-              <w:rPr>
-                <w:sz w:val="20"/>
-                <w:szCs w:val="20"/>
-              </w:rPr>
-              <w:t xml:space="preserve">Sprint 5: Sincronización Cloud Asíncrona</w:t>
-            </w:r>
-            <w:r>
-              <w:rPr>
-                <w:sz w:val="20"/>
-                <w:szCs w:val="20"/>
-              </w:rPr>
-            </w:r>
-            <w:r>
-              <w:rPr>
-                <w:sz w:val="20"/>
-                <w:szCs w:val="20"/>
-              </w:rPr>
+              <w:t xml:space="preserve">Fase 4: Pruebas y Certificación</w:t>
             </w:r>
           </w:p>
         </w:tc>
@@ -9330,25 +7010,7 @@
                 <w:sz w:val="20"/>
                 <w:szCs w:val="20"/>
               </w:rPr>
-            </w:r>
-            <w:r>
-              <w:rPr>
-                <w:sz w:val="20"/>
-                <w:szCs w:val="20"/>
-              </w:rPr>
-              <w:t xml:space="preserve">Servicio en background tolerante a fallos de red con reconexión automática e inserción incremental idempotente hacia base de datos cloud.</w:t>
-            </w:r>
-            <w:r>
-              <w:rPr>
-                <w:sz w:val="20"/>
-                <w:szCs w:val="20"/>
-              </w:rPr>
-            </w:r>
-            <w:r>
-              <w:rPr>
-                <w:sz w:val="20"/>
-                <w:szCs w:val="20"/>
-              </w:rPr>
+              <w:t xml:space="preserve">Pruebas automatizadas (163), de aislamiento entre automotoras y sucursales, revisión de seguridad y pruebas de aceptación del ciclo comercial con la automotora de demostración.</w:t>
             </w:r>
           </w:p>
         </w:tc>
@@ -9384,25 +7046,7 @@
                 <w:sz w:val="20"/>
                 <w:szCs w:val="20"/>
               </w:rPr>
-            </w:r>
-            <w:r>
-              <w:rPr>
-                <w:sz w:val="20"/>
-                <w:szCs w:val="20"/>
-              </w:rPr>
-              <w:t xml:space="preserve">Base de datos PostgreSQL en la nube, APIs seguras, simuladores de corte de red.</w:t>
-            </w:r>
-            <w:r>
-              <w:rPr>
-                <w:sz w:val="20"/>
-                <w:szCs w:val="20"/>
-              </w:rPr>
-            </w:r>
-            <w:r>
-              <w:rPr>
-                <w:sz w:val="20"/>
-                <w:szCs w:val="20"/>
-              </w:rPr>
+              <w:t xml:space="preserve">Jest, datos de demostración, lista de verificación de seguridad.</w:t>
             </w:r>
           </w:p>
         </w:tc>
@@ -9438,25 +7082,7 @@
                 <w:sz w:val="20"/>
                 <w:szCs w:val="20"/>
               </w:rPr>
-            </w:r>
-            <w:r>
-              <w:rPr>
-                <w:sz w:val="20"/>
-                <w:szCs w:val="20"/>
-              </w:rPr>
-              <w:t xml:space="preserve">Semanas 11 - 12 </w:t>
-            </w:r>
-            <w:r>
-              <w:rPr>
-                <w:sz w:val="20"/>
-                <w:szCs w:val="20"/>
-              </w:rPr>
-            </w:r>
-            <w:r>
-              <w:rPr>
-                <w:sz w:val="20"/>
-                <w:szCs w:val="20"/>
-              </w:rPr>
+              <w:t xml:space="preserve">Semanas 9 - 10</w:t>
             </w:r>
           </w:p>
         </w:tc>
@@ -9492,25 +7118,7 @@
                 <w:sz w:val="20"/>
                 <w:szCs w:val="20"/>
               </w:rPr>
-            </w:r>
-            <w:r>
-              <w:rPr>
-                <w:sz w:val="20"/>
-                <w:szCs w:val="20"/>
-              </w:rPr>
-              <w:t xml:space="preserve">Joaquin Cabrera</w:t>
-            </w:r>
-            <w:r>
-              <w:rPr>
-                <w:sz w:val="20"/>
-                <w:szCs w:val="20"/>
-              </w:rPr>
-            </w:r>
-            <w:r>
-              <w:rPr>
-                <w:sz w:val="20"/>
-                <w:szCs w:val="20"/>
-              </w:rPr>
+              <w:t xml:space="preserve">Joaquín Cabrera</w:t>
             </w:r>
           </w:p>
         </w:tc>
@@ -9546,25 +7154,7 @@
                 <w:sz w:val="20"/>
                 <w:szCs w:val="20"/>
               </w:rPr>
-            </w:r>
-            <w:r>
-              <w:rPr>
-                <w:sz w:val="20"/>
-                <w:szCs w:val="20"/>
-              </w:rPr>
-              <w:t xml:space="preserve">Facilitador: Esquema outbox implementado en Sprint 0. Dificultad: Manejo de conflictos de concurrencia y cortes intermitentes.</w:t>
-            </w:r>
-            <w:r>
-              <w:rPr>
-                <w:sz w:val="20"/>
-                <w:szCs w:val="20"/>
-              </w:rPr>
-            </w:r>
-            <w:r>
-              <w:rPr>
-                <w:sz w:val="20"/>
-                <w:szCs w:val="20"/>
-              </w:rPr>
+              <w:t xml:space="preserve">Facilitador: Pruebas automatizadas ya existentes. Dificultad: Cubrir casos límite de concurrencia y permisos por rol.</w:t>
             </w:r>
           </w:p>
         </w:tc>
@@ -9605,25 +7195,7 @@
                 <w:sz w:val="20"/>
                 <w:szCs w:val="20"/>
               </w:rPr>
-            </w:r>
-            <w:r>
-              <w:rPr>
-                <w:sz w:val="20"/>
-                <w:szCs w:val="20"/>
-              </w:rPr>
-              <w:t xml:space="preserve">Desarrollo Web y Experiencia de Usuario</w:t>
-            </w:r>
-            <w:r>
-              <w:rPr>
-                <w:sz w:val="20"/>
-                <w:szCs w:val="20"/>
-              </w:rPr>
-            </w:r>
-            <w:r>
-              <w:rPr>
-                <w:sz w:val="20"/>
-                <w:szCs w:val="20"/>
-              </w:rPr>
+              <w:t xml:space="preserve">Despliegue e Infraestructura</w:t>
             </w:r>
           </w:p>
         </w:tc>
@@ -9659,25 +7231,7 @@
                 <w:sz w:val="20"/>
                 <w:szCs w:val="20"/>
               </w:rPr>
-            </w:r>
-            <w:r>
-              <w:rPr>
-                <w:sz w:val="20"/>
-                <w:szCs w:val="20"/>
-              </w:rPr>
-              <w:t xml:space="preserve">Desarrollo Web y Experiencia de Usuario</w:t>
-            </w:r>
-            <w:r>
-              <w:rPr>
-                <w:sz w:val="20"/>
-                <w:szCs w:val="20"/>
-              </w:rPr>
-            </w:r>
-            <w:r>
-              <w:rPr>
-                <w:sz w:val="20"/>
-                <w:szCs w:val="20"/>
-              </w:rPr>
+              <w:t xml:space="preserve">Fase 5.1: Despliegue en Producción</w:t>
             </w:r>
           </w:p>
         </w:tc>
@@ -9713,25 +7267,7 @@
                 <w:sz w:val="20"/>
                 <w:szCs w:val="20"/>
               </w:rPr>
-            </w:r>
-            <w:r>
-              <w:rPr>
-                <w:sz w:val="20"/>
-                <w:szCs w:val="20"/>
-              </w:rPr>
-              <w:t xml:space="preserve">Construcción del panel web responsivo optimizado para teléfonos del propietario con gráficos interactivos y visualización en vivo de turnos.</w:t>
-            </w:r>
-            <w:r>
-              <w:rPr>
-                <w:sz w:val="20"/>
-                <w:szCs w:val="20"/>
-              </w:rPr>
-            </w:r>
-            <w:r>
-              <w:rPr>
-                <w:sz w:val="20"/>
-                <w:szCs w:val="20"/>
-              </w:rPr>
+              <w:t xml:space="preserve">Contratación del dominio, servidor, DNS en Cloudflare, HTTPS con certificado comodín, verificación de correo, Docker Compose, GitHub Actions, respaldo diario e indexación en buscadores.</w:t>
             </w:r>
           </w:p>
         </w:tc>
@@ -9767,25 +7303,7 @@
                 <w:sz w:val="20"/>
                 <w:szCs w:val="20"/>
               </w:rPr>
-            </w:r>
-            <w:r>
-              <w:rPr>
-                <w:sz w:val="20"/>
-                <w:szCs w:val="20"/>
-              </w:rPr>
-              <w:t xml:space="preserve">Framework web frontend, hosting cloud serverless, dispositivos móviles.</w:t>
-            </w:r>
-            <w:r>
-              <w:rPr>
-                <w:sz w:val="20"/>
-                <w:szCs w:val="20"/>
-              </w:rPr>
-            </w:r>
-            <w:r>
-              <w:rPr>
-                <w:sz w:val="20"/>
-                <w:szCs w:val="20"/>
-              </w:rPr>
+              <w:t xml:space="preserve">Hetzner Cloud, Docker, Caddy, Cloudflare, Resend, GitHub Actions.</w:t>
             </w:r>
           </w:p>
         </w:tc>
@@ -9821,25 +7339,7 @@
                 <w:sz w:val="20"/>
                 <w:szCs w:val="20"/>
               </w:rPr>
-            </w:r>
-            <w:r>
-              <w:rPr>
-                <w:sz w:val="20"/>
-                <w:szCs w:val="20"/>
-              </w:rPr>
-              <w:t xml:space="preserve">Semanas 13 - 14 </w:t>
-            </w:r>
-            <w:r>
-              <w:rPr>
-                <w:sz w:val="20"/>
-                <w:szCs w:val="20"/>
-              </w:rPr>
-            </w:r>
-            <w:r>
-              <w:rPr>
-                <w:sz w:val="20"/>
-                <w:szCs w:val="20"/>
-              </w:rPr>
+              <w:t xml:space="preserve">Semanas 11 - 12</w:t>
             </w:r>
           </w:p>
         </w:tc>
@@ -9875,25 +7375,7 @@
                 <w:sz w:val="20"/>
                 <w:szCs w:val="20"/>
               </w:rPr>
-            </w:r>
-            <w:r>
-              <w:rPr>
-                <w:sz w:val="20"/>
-                <w:szCs w:val="20"/>
-              </w:rPr>
-              <w:t xml:space="preserve">Sebastián Quilodran / Brayan Cid</w:t>
-            </w:r>
-            <w:r>
-              <w:rPr>
-                <w:sz w:val="20"/>
-                <w:szCs w:val="20"/>
-              </w:rPr>
-            </w:r>
-            <w:r>
-              <w:rPr>
-                <w:sz w:val="20"/>
-                <w:szCs w:val="20"/>
-              </w:rPr>
+              <w:t xml:space="preserve">Joaquín Cabrera</w:t>
             </w:r>
           </w:p>
         </w:tc>
@@ -9929,25 +7411,7 @@
                 <w:sz w:val="20"/>
                 <w:szCs w:val="20"/>
               </w:rPr>
-            </w:r>
-            <w:r>
-              <w:rPr>
-                <w:sz w:val="20"/>
-                <w:szCs w:val="20"/>
-              </w:rPr>
-              <w:t xml:space="preserve">Facilitador: Esquema outbox implementado en Sprint 0. Dificultad: Manejo de conflictos de concurrencia y cortes intermitentes.</w:t>
-            </w:r>
-            <w:r>
-              <w:rPr>
-                <w:sz w:val="20"/>
-                <w:szCs w:val="20"/>
-              </w:rPr>
-            </w:r>
-            <w:r>
-              <w:rPr>
-                <w:sz w:val="20"/>
-                <w:szCs w:val="20"/>
-              </w:rPr>
+              <w:t xml:space="preserve">Facilitador: Infraestructura de bajo costo planificada. Dificultad: Certificado comodín y entrega de correos (SPF/DKIM).</w:t>
             </w:r>
           </w:p>
         </w:tc>
@@ -9988,25 +7452,7 @@
                 <w:sz w:val="20"/>
                 <w:szCs w:val="20"/>
               </w:rPr>
-            </w:r>
-            <w:r>
-              <w:rPr>
-                <w:sz w:val="20"/>
-                <w:szCs w:val="20"/>
-              </w:rPr>
-              <w:t xml:space="preserve">Pruebas, Calidad y Certificación</w:t>
-            </w:r>
-            <w:r>
-              <w:rPr>
-                <w:sz w:val="20"/>
-                <w:szCs w:val="20"/>
-              </w:rPr>
-            </w:r>
-            <w:r>
-              <w:rPr>
-                <w:sz w:val="20"/>
-                <w:szCs w:val="20"/>
-              </w:rPr>
+              <w:t xml:space="preserve">Gestión de Proyectos y Documentación</w:t>
             </w:r>
           </w:p>
         </w:tc>
@@ -10042,25 +7488,7 @@
                 <w:sz w:val="20"/>
                 <w:szCs w:val="20"/>
               </w:rPr>
-            </w:r>
-            <w:r>
-              <w:rPr>
-                <w:sz w:val="20"/>
-                <w:szCs w:val="20"/>
-              </w:rPr>
-              <w:t xml:space="preserve">Sprint 7: Validación en Terreno, Certificación y Cierre</w:t>
-            </w:r>
-            <w:r>
-              <w:rPr>
-                <w:sz w:val="20"/>
-                <w:szCs w:val="20"/>
-              </w:rPr>
-            </w:r>
-            <w:r>
-              <w:rPr>
-                <w:sz w:val="20"/>
-                <w:szCs w:val="20"/>
-              </w:rPr>
+              <w:t xml:space="preserve">Fase 5.2: Manuales y Cierre</w:t>
             </w:r>
           </w:p>
         </w:tc>
@@ -10096,25 +7524,7 @@
                 <w:sz w:val="20"/>
                 <w:szCs w:val="20"/>
               </w:rPr>
-            </w:r>
-            <w:r>
-              <w:rPr>
-                <w:sz w:val="20"/>
-                <w:szCs w:val="20"/>
-              </w:rPr>
-              <w:t xml:space="preserve">Pruebas integrales de carga, simulación de cortes de red en local real, capacitación de operadores, manuales técnicos y memoria de título.</w:t>
-            </w:r>
-            <w:r>
-              <w:rPr>
-                <w:sz w:val="20"/>
-                <w:szCs w:val="20"/>
-              </w:rPr>
-            </w:r>
-            <w:r>
-              <w:rPr>
-                <w:sz w:val="20"/>
-                <w:szCs w:val="20"/>
-              </w:rPr>
+              <w:t xml:space="preserve">Manuales de usuario y administrador, memoria final del proyecto y entrega formal de la documentación.</w:t>
             </w:r>
           </w:p>
         </w:tc>
@@ -10150,25 +7560,7 @@
                 <w:sz w:val="20"/>
                 <w:szCs w:val="20"/>
               </w:rPr>
-            </w:r>
-            <w:r>
-              <w:rPr>
-                <w:sz w:val="20"/>
-                <w:szCs w:val="20"/>
-              </w:rPr>
-              <w:t xml:space="preserve">Local comercial del cliente, servidor de producción, herramientas de prueba.</w:t>
-            </w:r>
-            <w:r>
-              <w:rPr>
-                <w:sz w:val="20"/>
-                <w:szCs w:val="20"/>
-              </w:rPr>
-            </w:r>
-            <w:r>
-              <w:rPr>
-                <w:sz w:val="20"/>
-                <w:szCs w:val="20"/>
-              </w:rPr>
+              <w:t xml:space="preserve">Documentación del repositorio, sistema desplegado.</w:t>
             </w:r>
           </w:p>
         </w:tc>
@@ -10204,25 +7596,7 @@
                 <w:sz w:val="20"/>
                 <w:szCs w:val="20"/>
               </w:rPr>
-            </w:r>
-            <w:r>
-              <w:rPr>
-                <w:sz w:val="20"/>
-                <w:szCs w:val="20"/>
-              </w:rPr>
-              <w:t xml:space="preserve">Semana 15 </w:t>
-            </w:r>
-            <w:r>
-              <w:rPr>
-                <w:sz w:val="20"/>
-                <w:szCs w:val="20"/>
-              </w:rPr>
-            </w:r>
-            <w:r>
-              <w:rPr>
-                <w:sz w:val="20"/>
-                <w:szCs w:val="20"/>
-              </w:rPr>
+              <w:t xml:space="preserve">Semanas 13 - 14</w:t>
             </w:r>
           </w:p>
         </w:tc>
@@ -10258,25 +7632,7 @@
                 <w:sz w:val="20"/>
                 <w:szCs w:val="20"/>
               </w:rPr>
-            </w:r>
-            <w:r>
-              <w:rPr>
-                <w:sz w:val="20"/>
-                <w:szCs w:val="20"/>
-              </w:rPr>
-              <w:t xml:space="preserve">Todo el Equipo</w:t>
-            </w:r>
-            <w:r>
-              <w:rPr>
-                <w:sz w:val="20"/>
-                <w:szCs w:val="20"/>
-              </w:rPr>
-            </w:r>
-            <w:r>
-              <w:rPr>
-                <w:sz w:val="20"/>
-                <w:szCs w:val="20"/>
-              </w:rPr>
+              <w:t xml:space="preserve">Joaquín Cabrera</w:t>
             </w:r>
           </w:p>
         </w:tc>
@@ -10312,25 +7668,7 @@
                 <w:sz w:val="20"/>
                 <w:szCs w:val="20"/>
               </w:rPr>
-            </w:r>
-            <w:r>
-              <w:rPr>
-                <w:sz w:val="20"/>
-                <w:szCs w:val="20"/>
-              </w:rPr>
-              <w:t xml:space="preserve">Facilitador: Disposición y acceso directo al comercio del cliente. Dificultad: Ajustar detalles de último momento previos a la entrega final.</w:t>
-            </w:r>
-            <w:r>
-              <w:rPr>
-                <w:sz w:val="20"/>
-                <w:szCs w:val="20"/>
-              </w:rPr>
-            </w:r>
-            <w:r>
-              <w:rPr>
-                <w:sz w:val="20"/>
-                <w:szCs w:val="20"/>
-              </w:rPr>
+              <w:t xml:space="preserve">Facilitador: Documentación mantenida durante todo el proyecto. Dificultad: Ajustes de último momento previos a la entrega.</w:t>
             </w:r>
           </w:p>
         </w:tc>
@@ -10681,48 +8019,6 @@
                 </mc:Fallback>
               </mc:AlternateContent>
             </w:r>
-            <w:r>
-              <w:rPr>
-                <w:color w:val="1f3864"/>
-              </w:rPr>
-            </w:r>
-            <w:r>
-              <w:rPr>
-                <w:color w:val="1f3864"/>
-              </w:rPr>
-            </w:r>
-          </w:p>
-          <w:p>
-            <w:pPr>
-              <w:pBdr/>
-              <w:spacing/>
-              <w:ind/>
-              <w:rPr>
-                <w:color w:val="1f3864"/>
-              </w:rPr>
-            </w:pPr>
-            <w:r>
-              <w:t xml:space="preserve">Link carta gantt: </w:t>
-            </w:r>
-            <w:r>
-              <w:rPr>
-                <w:lang w:val="es-ES"/>
-              </w:rPr>
-            </w:r>
-            <w:hyperlink r:id="rId13" w:tooltip="https://docs.google.com/spreadsheets/d/1M7QbCdacNNejPZaqe_oz3CZndsZHIrK4XOt7Qx0Ovns/edit?usp=sharing" w:history="1">
-              <w:r>
-                <w:rPr>
-                  <w:rStyle w:val="976"/>
-                  <w:lang w:val="es-ES"/>
-                </w:rPr>
-                <w:t xml:space="preserve">Gantt</w:t>
-              </w:r>
-              <w:r>
-                <w:rPr>
-                  <w:rStyle w:val="976"/>
-                </w:rPr>
-              </w:r>
-            </w:hyperlink>
             <w:r>
               <w:rPr>
                 <w:color w:val="1f3864"/>

</xml_diff>